<commit_message>
feat: sync portfolio with new CV, add AWS Certified AI Practitioner
Replace CV PDF and DOCX, update roles, summaries, skills, and GPA,
and key certifications by title since two share the Credly ID.

Co-Authored-By: Claude Opus 5.5 <noreply@anthropic.com>
</commit_message>
<xml_diff>
--- a/public/CV_Marshall_Rasendria_Mahendra.docx
+++ b/public/CV_Marshall_Rasendria_Mahendra.docx
@@ -333,7 +333,7 @@
           <w:sz w:val="20"/>
           <w:szCs w:val="20"/>
         </w:rPr>
-        <w:t>Full-Stack Web Development: React, Next.js, TypeScript, Node.js, NestJS, Express.js, FastAPI, PHP, Laravel, PostgreSQL, Prisma, Supabase, RESTful APIs, Docker, Git/GitHub. Integrations: Midtrans, Google OAuth, SMTP, dompdf.</w:t>
+        <w:t>Microsoft Power Platform: Power Apps, Power Automate, AI Builder, TypeScript Office Scripts, approval workflows, and Microsoft 365 integration.</w:t>
       </w:r>
     </w:p>
     <w:p>
@@ -356,7 +356,7 @@
           <w:sz w:val="20"/>
           <w:szCs w:val="20"/>
         </w:rPr>
-        <w:t>Artificial Intelligence &amp; ML: Python, TensorFlow / TensorFlow.js, PyTorch, Scikit-Learn, OpenCV, MediaPipe, YOLO. CNNs (2D/1D), transfer learning, model explainability (Grad-CAM), leakage-free evaluation (patient-level splits, ROC/AUC, F1).</w:t>
+        <w:t>Artificial Intelligence &amp; Machine Learning: Python, PyTorch, TensorFlow, Scikit-Learn, OpenCV, transfer learning, model evaluation, and explainability.</w:t>
       </w:r>
     </w:p>
     <w:p>
@@ -379,7 +379,7 @@
           <w:sz w:val="20"/>
           <w:szCs w:val="20"/>
         </w:rPr>
-        <w:t>LLM Application Development: OpenAI API, LangChain, Retrieval-Augmented Generation (RAG), Prompt Engineering, Regular Expressions.</w:t>
+        <w:t>LLM &amp; Document Intelligence: OpenAI API, LangChain, RAG, prompt engineering, OCR, invoice data extraction, and human-in-the-loop validation.</w:t>
       </w:r>
     </w:p>
     <w:p>
@@ -402,7 +402,7 @@
           <w:sz w:val="20"/>
           <w:szCs w:val="20"/>
         </w:rPr>
-        <w:t>Enterprise Systems: Odoo &amp; SAP.</w:t>
+        <w:t>Enterprise Process Automation: SAP S/4HANA invoice data mapping, posting-template alignment, Accounts Payable workflows, duplicate detection, and audit logging.</w:t>
       </w:r>
     </w:p>
     <w:p>
@@ -425,7 +425,7 @@
           <w:sz w:val="20"/>
           <w:szCs w:val="20"/>
         </w:rPr>
-        <w:t>3D &amp; Graphics: Three.js, react-three-fiber, on-device inference, real-time computer vision (analytic inverse kinematics).</w:t>
+        <w:t>Data &amp; Backend Engineering: SQL, Pandas, NumPy, FastAPI, RESTful APIs, PostgreSQL, Docker, and Git/GitHub.</w:t>
       </w:r>
     </w:p>
     <w:p>
@@ -448,7 +448,7 @@
           <w:sz w:val="20"/>
           <w:szCs w:val="20"/>
         </w:rPr>
-        <w:t>Data Science &amp; Analytics: Pandas, NumPy, SQL (Advanced), Matplotlib, Jupyter Notebook, Kaggle, Google Cloud Platform.</w:t>
+        <w:t>AWS &amp; Generative AI Fundamentals: Amazon Bedrock, foundation models, and agentic AI concepts.</w:t>
       </w:r>
     </w:p>
     <w:p>
@@ -510,7 +510,7 @@
           <w:sz w:val="20"/>
           <w:szCs w:val="20"/>
         </w:rPr>
-        <w:t>PT Data Labs Analytics (Internship)</w:t>
+        <w:t>PT Bumi Resources Tbk (Internship)</w:t>
       </w:r>
       <w:r>
         <w:rPr>
@@ -519,7 +519,7 @@
           <w:szCs w:val="20"/>
         </w:rPr>
         <w:tab/>
-        <w:t>June 2026 – Present</w:t>
+        <w:t>August 2026 – Present</w:t>
       </w:r>
     </w:p>
     <w:p>
@@ -542,7 +542,7 @@
           <w:sz w:val="20"/>
           <w:szCs w:val="20"/>
         </w:rPr>
-        <w:t>Delivering AI/ML solutions for an enterprise client as part of the company’s outsourced engineering team, contributing across the full model development lifecycle</w:t>
+        <w:t>Developing AI-powered Accounts Payable automation using Microsoft Power Automate, AI Builder, and TypeScript Office Scripts, transforming invoice documents into structured financial data aligned with SAP S/4HANA posting requirements</w:t>
       </w:r>
       <w:r>
         <w:rPr>
@@ -573,7 +573,15 @@
           <w:sz w:val="20"/>
           <w:szCs w:val="20"/>
         </w:rPr>
-        <w:t>Operating within a client-facing engagement under confidentiality constraints, translating business requirements into technical solutions while following the team’s production standards for reproducibility, code quality, and reliable delivery.</w:t>
+        <w:t>Translating finance and SAP requirements into automated data mapping across a 43-column posting template, including document headers, invoice line items, currencies, and debit-credit validation</w:t>
+      </w:r>
+      <w:r>
+        <w:rPr>
+          <w:rFonts w:ascii="Times New Roman" w:hAnsi="Times New Roman" w:cs="Times New Roman"/>
+          <w:sz w:val="20"/>
+          <w:szCs w:val="20"/>
+        </w:rPr>
+        <w:t>.</w:t>
       </w:r>
     </w:p>
     <w:p>
@@ -596,19 +604,16 @@
           <w:sz w:val="20"/>
           <w:szCs w:val="20"/>
         </w:rPr>
-        <w:t>Gained hands-on experience working within the Google Cloud Platform environment, using BigQuery for large-scale data querying and processing as part of the client’s cloud-based data workflow.</w:t>
-      </w:r>
-    </w:p>
-    <w:p>
-      <w:pPr>
-        <w:pStyle w:val="ListParagraph"/>
-        <w:spacing w:after="0" w:line="240" w:lineRule="auto"/>
-        <w:rPr>
-          <w:rFonts w:ascii="Times New Roman" w:hAnsi="Times New Roman" w:cs="Times New Roman"/>
-          <w:sz w:val="20"/>
-          <w:szCs w:val="20"/>
-        </w:rPr>
-      </w:pPr>
+        <w:t>Building human review and approval workflows with duplicate detection, automated notifications, and audit logging, while refining AI extraction prompts and validating outputs against sample invoices</w:t>
+      </w:r>
+      <w:r>
+        <w:rPr>
+          <w:rFonts w:ascii="Times New Roman" w:hAnsi="Times New Roman" w:cs="Times New Roman"/>
+          <w:sz w:val="20"/>
+          <w:szCs w:val="20"/>
+        </w:rPr>
+        <w:t>.</w:t>
+      </w:r>
     </w:p>
     <w:p>
       <w:pPr>
@@ -618,27 +623,42 @@
         <w:spacing w:after="0" w:line="240" w:lineRule="auto"/>
         <w:rPr>
           <w:rFonts w:ascii="Times New Roman" w:hAnsi="Times New Roman" w:cs="Times New Roman"/>
-          <w:sz w:val="20"/>
-          <w:szCs w:val="20"/>
-        </w:rPr>
-      </w:pPr>
-      <w:r>
-        <w:rPr>
-          <w:rFonts w:ascii="Times New Roman" w:hAnsi="Times New Roman" w:cs="Times New Roman"/>
           <w:b/>
           <w:bCs/>
           <w:sz w:val="20"/>
           <w:szCs w:val="20"/>
         </w:rPr>
-        <w:t xml:space="preserve">Machine Learning Engineer | </w:t>
-      </w:r>
-      <w:r>
-        <w:rPr>
-          <w:rFonts w:ascii="Times New Roman" w:hAnsi="Times New Roman" w:cs="Times New Roman"/>
-          <w:sz w:val="20"/>
-          <w:szCs w:val="20"/>
-        </w:rPr>
-        <w:t>HUMIC Engineering Research Center (Internship)</w:t>
+      </w:pPr>
+    </w:p>
+    <w:p>
+      <w:pPr>
+        <w:tabs>
+          <w:tab w:val="right" w:pos="10466"/>
+        </w:tabs>
+        <w:spacing w:after="0" w:line="240" w:lineRule="auto"/>
+        <w:rPr>
+          <w:rFonts w:ascii="Times New Roman" w:hAnsi="Times New Roman" w:cs="Times New Roman"/>
+          <w:sz w:val="20"/>
+          <w:szCs w:val="20"/>
+        </w:rPr>
+      </w:pPr>
+      <w:r>
+        <w:rPr>
+          <w:rFonts w:ascii="Times New Roman" w:hAnsi="Times New Roman" w:cs="Times New Roman"/>
+          <w:b/>
+          <w:bCs/>
+          <w:sz w:val="20"/>
+          <w:szCs w:val="20"/>
+        </w:rPr>
+        <w:t xml:space="preserve">Artificial Intelligence Engineer | </w:t>
+      </w:r>
+      <w:r>
+        <w:rPr>
+          <w:rFonts w:ascii="Times New Roman" w:hAnsi="Times New Roman" w:cs="Times New Roman"/>
+          <w:sz w:val="20"/>
+          <w:szCs w:val="20"/>
+        </w:rPr>
+        <w:t>PT Data Labs Analytics (Internship)</w:t>
       </w:r>
       <w:r>
         <w:rPr>
@@ -647,7 +667,15 @@
           <w:szCs w:val="20"/>
         </w:rPr>
         <w:tab/>
-        <w:t>April 2026 – Present</w:t>
+        <w:t xml:space="preserve">June 2026 – </w:t>
+      </w:r>
+      <w:r>
+        <w:rPr>
+          <w:rFonts w:ascii="Times New Roman" w:hAnsi="Times New Roman" w:cs="Times New Roman"/>
+          <w:sz w:val="20"/>
+          <w:szCs w:val="20"/>
+        </w:rPr>
+        <w:t>August 2026</w:t>
       </w:r>
     </w:p>
     <w:p>
@@ -657,19 +685,28 @@
           <w:ilvl w:val="0"/>
           <w:numId w:val="3"/>
         </w:numPr>
-        <w:rPr>
-          <w:rFonts w:ascii="Times New Roman" w:hAnsi="Times New Roman" w:cs="Times New Roman"/>
-          <w:sz w:val="20"/>
-          <w:szCs w:val="20"/>
-        </w:rPr>
-      </w:pPr>
-      <w:r>
-        <w:rPr>
-          <w:rFonts w:ascii="Times New Roman" w:hAnsi="Times New Roman" w:cs="Times New Roman"/>
-          <w:sz w:val="20"/>
-          <w:szCs w:val="20"/>
-        </w:rPr>
-        <w:t>Conducted a Systematic Literature Review across IEEE, Scopus, and Google Scholar, appraising 10+ papers and exposing that many 98 to 99% accuracy claims come from patient-level data leakage, which set an honest 0.85 AUC target.</w:t>
+        <w:spacing w:after="0" w:line="240" w:lineRule="auto"/>
+        <w:rPr>
+          <w:rFonts w:ascii="Times New Roman" w:hAnsi="Times New Roman" w:cs="Times New Roman"/>
+          <w:sz w:val="20"/>
+          <w:szCs w:val="20"/>
+        </w:rPr>
+      </w:pPr>
+      <w:r>
+        <w:rPr>
+          <w:rFonts w:ascii="Times New Roman" w:hAnsi="Times New Roman" w:cs="Times New Roman"/>
+          <w:sz w:val="20"/>
+          <w:szCs w:val="20"/>
+        </w:rPr>
+        <w:t>Delivering AI/ML solutions for an enterprise client as part of the company’s outsourced engineering team, contributing across the full model development lifecycle</w:t>
+      </w:r>
+      <w:r>
+        <w:rPr>
+          <w:rFonts w:ascii="Times New Roman" w:hAnsi="Times New Roman" w:cs="Times New Roman"/>
+          <w:sz w:val="20"/>
+          <w:szCs w:val="20"/>
+        </w:rPr>
+        <w:t>.</w:t>
       </w:r>
     </w:p>
     <w:p>
@@ -679,19 +716,20 @@
           <w:ilvl w:val="0"/>
           <w:numId w:val="3"/>
         </w:numPr>
-        <w:rPr>
-          <w:rFonts w:ascii="Times New Roman" w:hAnsi="Times New Roman" w:cs="Times New Roman"/>
-          <w:sz w:val="20"/>
-          <w:szCs w:val="20"/>
-        </w:rPr>
-      </w:pPr>
-      <w:r>
-        <w:rPr>
-          <w:rFonts w:ascii="Times New Roman" w:hAnsi="Times New Roman" w:cs="Times New Roman"/>
-          <w:sz w:val="20"/>
-          <w:szCs w:val="20"/>
-        </w:rPr>
-        <w:t>Built leakage-free PyTorch pipelines on CBIS-DDSM (whole-image and ROI, patient-level split) and trained 6 architectures, from EfficientNet-B3 and ConvNeXt to a CBAM hybrid-fusion network and Mammo-CLIP, across 12+ controlled experiments.</w:t>
+        <w:spacing w:after="0" w:line="240" w:lineRule="auto"/>
+        <w:rPr>
+          <w:rFonts w:ascii="Times New Roman" w:hAnsi="Times New Roman" w:cs="Times New Roman"/>
+          <w:sz w:val="20"/>
+          <w:szCs w:val="20"/>
+        </w:rPr>
+      </w:pPr>
+      <w:r>
+        <w:rPr>
+          <w:rFonts w:ascii="Times New Roman" w:hAnsi="Times New Roman" w:cs="Times New Roman"/>
+          <w:sz w:val="20"/>
+          <w:szCs w:val="20"/>
+        </w:rPr>
+        <w:t>Operating within a client-facing engagement under confidentiality constraints, translating business requirements into technical solutions while following the team’s production standards for reproducibility, code quality, and reliable delivery.</w:t>
       </w:r>
     </w:p>
     <w:p>
@@ -701,50 +739,32 @@
           <w:ilvl w:val="0"/>
           <w:numId w:val="3"/>
         </w:numPr>
-        <w:rPr>
-          <w:rFonts w:ascii="Times New Roman" w:hAnsi="Times New Roman" w:cs="Times New Roman"/>
-          <w:sz w:val="20"/>
-          <w:szCs w:val="20"/>
-        </w:rPr>
-      </w:pPr>
-      <w:r>
-        <w:rPr>
-          <w:rFonts w:ascii="Times New Roman" w:hAnsi="Times New Roman" w:cs="Times New Roman"/>
-          <w:sz w:val="20"/>
-          <w:szCs w:val="20"/>
-        </w:rPr>
-        <w:t>Raised AUC by ~6 points with clinical-metadata fusion (0.80 to 0.86), evaluated with F1, ROC/AUC, and confusion matrices plus Grad-CAM, and first-authored a 6-page IEEE conference paper.</w:t>
-      </w:r>
-    </w:p>
-    <w:p>
-      <w:pPr>
-        <w:pBdr>
-          <w:bottom w:val="single" w:sz="6" w:space="1" w:color="auto"/>
-        </w:pBdr>
-        <w:spacing w:after="0" w:line="240" w:lineRule="auto"/>
-        <w:rPr>
-          <w:rFonts w:ascii="Times New Roman" w:hAnsi="Times New Roman" w:cs="Times New Roman"/>
-          <w:b/>
-          <w:bCs/>
-        </w:rPr>
-      </w:pPr>
-      <w:r>
-        <w:rPr>
-          <w:rFonts w:ascii="Times New Roman" w:hAnsi="Times New Roman" w:cs="Times New Roman"/>
-          <w:b/>
-          <w:bCs/>
-          <w:lang w:val="en"/>
-        </w:rPr>
-        <w:t>ORGANIZATIONAL EXPERIENCE</w:t>
-      </w:r>
-      <w:r>
-        <w:rPr>
-          <w:rFonts w:ascii="Times New Roman" w:hAnsi="Times New Roman" w:cs="Times New Roman"/>
-          <w:b/>
-          <w:bCs/>
-        </w:rPr>
-        <w:t>S</w:t>
-      </w:r>
+        <w:spacing w:after="0" w:line="240" w:lineRule="auto"/>
+        <w:rPr>
+          <w:rFonts w:ascii="Times New Roman" w:hAnsi="Times New Roman" w:cs="Times New Roman"/>
+          <w:sz w:val="20"/>
+          <w:szCs w:val="20"/>
+        </w:rPr>
+      </w:pPr>
+      <w:r>
+        <w:rPr>
+          <w:rFonts w:ascii="Times New Roman" w:hAnsi="Times New Roman" w:cs="Times New Roman"/>
+          <w:sz w:val="20"/>
+          <w:szCs w:val="20"/>
+        </w:rPr>
+        <w:t>Gained hands-on experience working within the Google Cloud Platform environment, using BigQuery for large-scale data querying and processing as part of the client’s cloud-based data workflow.</w:t>
+      </w:r>
+    </w:p>
+    <w:p>
+      <w:pPr>
+        <w:pStyle w:val="ListParagraph"/>
+        <w:spacing w:after="0" w:line="240" w:lineRule="auto"/>
+        <w:rPr>
+          <w:rFonts w:ascii="Times New Roman" w:hAnsi="Times New Roman" w:cs="Times New Roman"/>
+          <w:sz w:val="20"/>
+          <w:szCs w:val="20"/>
+        </w:rPr>
+      </w:pPr>
     </w:p>
     <w:p>
       <w:pPr>
@@ -766,15 +786,35 @@
           <w:sz w:val="20"/>
           <w:szCs w:val="20"/>
         </w:rPr>
-        <w:t xml:space="preserve">Full-Stack Developer | </w:t>
-      </w:r>
-      <w:r>
-        <w:rPr>
-          <w:rFonts w:ascii="Times New Roman" w:hAnsi="Times New Roman" w:cs="Times New Roman"/>
-          <w:sz w:val="20"/>
-          <w:szCs w:val="20"/>
-        </w:rPr>
-        <w:t>Central Computer Improvement (CCI) Telkom University</w:t>
+        <w:t xml:space="preserve"> </w:t>
+      </w:r>
+      <w:r>
+        <w:rPr>
+          <w:rFonts w:ascii="Times New Roman" w:hAnsi="Times New Roman" w:cs="Times New Roman"/>
+          <w:b/>
+          <w:bCs/>
+          <w:sz w:val="20"/>
+          <w:szCs w:val="20"/>
+        </w:rPr>
+        <w:t xml:space="preserve">Artificial Intelligence </w:t>
+      </w:r>
+      <w:r>
+        <w:rPr>
+          <w:rFonts w:ascii="Times New Roman" w:hAnsi="Times New Roman" w:cs="Times New Roman"/>
+          <w:b/>
+          <w:bCs/>
+          <w:sz w:val="20"/>
+          <w:szCs w:val="20"/>
+        </w:rPr>
+        <w:t xml:space="preserve">Engineer | </w:t>
+      </w:r>
+      <w:r>
+        <w:rPr>
+          <w:rFonts w:ascii="Times New Roman" w:hAnsi="Times New Roman" w:cs="Times New Roman"/>
+          <w:sz w:val="20"/>
+          <w:szCs w:val="20"/>
+        </w:rPr>
+        <w:t>HUMIC Engineering Research Center (Internship)</w:t>
       </w:r>
       <w:r>
         <w:rPr>
@@ -783,7 +823,15 @@
           <w:szCs w:val="20"/>
         </w:rPr>
         <w:tab/>
-        <w:t>February 2026 – Present</w:t>
+        <w:t xml:space="preserve">April 2026 – </w:t>
+      </w:r>
+      <w:r>
+        <w:rPr>
+          <w:rFonts w:ascii="Times New Roman" w:hAnsi="Times New Roman" w:cs="Times New Roman"/>
+          <w:sz w:val="20"/>
+          <w:szCs w:val="20"/>
+        </w:rPr>
+        <w:t>June 2026</w:t>
       </w:r>
     </w:p>
     <w:p>
@@ -793,20 +841,27 @@
           <w:ilvl w:val="0"/>
           <w:numId w:val="3"/>
         </w:numPr>
-        <w:spacing w:after="0" w:line="240" w:lineRule="auto"/>
-        <w:rPr>
-          <w:rFonts w:ascii="Times New Roman" w:hAnsi="Times New Roman" w:cs="Times New Roman"/>
-          <w:sz w:val="20"/>
-          <w:szCs w:val="20"/>
-        </w:rPr>
-      </w:pPr>
-      <w:r>
-        <w:rPr>
-          <w:rFonts w:ascii="Times New Roman" w:hAnsi="Times New Roman" w:cs="Times New Roman"/>
-          <w:sz w:val="20"/>
-          <w:szCs w:val="20"/>
-        </w:rPr>
-        <w:t>Served as backend developer on a 6-person engineering team building a vendor marketplace platform in partnership with UKM CSC, developing 90+ RESTful API endpoints using NestJS, PostgreSQL, and Prisma ORM. Authored full API documentation, tested endpoints with Postman, and configured Supabase, Midtrans payment gateway, SMTP, and Google OAuth integrations.</w:t>
+        <w:rPr>
+          <w:rFonts w:ascii="Times New Roman" w:hAnsi="Times New Roman" w:cs="Times New Roman"/>
+          <w:sz w:val="20"/>
+          <w:szCs w:val="20"/>
+        </w:rPr>
+      </w:pPr>
+      <w:r>
+        <w:rPr>
+          <w:rFonts w:ascii="Times New Roman" w:hAnsi="Times New Roman" w:cs="Times New Roman"/>
+          <w:sz w:val="20"/>
+          <w:szCs w:val="20"/>
+        </w:rPr>
+        <w:t>Designed and implemented reproducible mammogram classification pipelines, covering dataset curation, image preprocessing, patient-level splitting, and clinical metadata encoding</w:t>
+      </w:r>
+      <w:r>
+        <w:rPr>
+          <w:rFonts w:ascii="Times New Roman" w:hAnsi="Times New Roman" w:cs="Times New Roman"/>
+          <w:sz w:val="20"/>
+          <w:szCs w:val="20"/>
+        </w:rPr>
+        <w:t>.</w:t>
       </w:r>
     </w:p>
     <w:p>
@@ -816,72 +871,19 @@
           <w:ilvl w:val="0"/>
           <w:numId w:val="3"/>
         </w:numPr>
-        <w:spacing w:after="0" w:line="240" w:lineRule="auto"/>
-        <w:rPr>
-          <w:rFonts w:ascii="Times New Roman" w:hAnsi="Times New Roman" w:cs="Times New Roman"/>
-          <w:sz w:val="20"/>
-          <w:szCs w:val="20"/>
-        </w:rPr>
-      </w:pPr>
-      <w:r>
-        <w:rPr>
-          <w:rFonts w:ascii="Times New Roman" w:hAnsi="Times New Roman" w:cs="Times New Roman"/>
-          <w:sz w:val="20"/>
-          <w:szCs w:val="20"/>
-        </w:rPr>
-        <w:t>Independently built a full stack document automation platform for Telkom University's student directorate, enabling 50+ student organizations to auto generate Proposal Kegiatan and LPJ documents, cutting processing time from 2+ hours to minutes. Designed the system from scratch with no predefined spec, replicated official templates via dompdf, and passed a penetration test from Telkom's PuTI Directorate before deployment.</w:t>
-      </w:r>
-    </w:p>
-    <w:p>
-      <w:pPr>
-        <w:pStyle w:val="ListParagraph"/>
-        <w:spacing w:after="0" w:line="240" w:lineRule="auto"/>
-        <w:rPr>
-          <w:rFonts w:ascii="Times New Roman" w:hAnsi="Times New Roman" w:cs="Times New Roman"/>
-          <w:sz w:val="20"/>
-          <w:szCs w:val="20"/>
-        </w:rPr>
-      </w:pPr>
-    </w:p>
-    <w:p>
-      <w:pPr>
-        <w:tabs>
-          <w:tab w:val="right" w:pos="10466"/>
-        </w:tabs>
-        <w:spacing w:after="0" w:line="240" w:lineRule="auto"/>
-        <w:rPr>
-          <w:rFonts w:ascii="Times New Roman" w:hAnsi="Times New Roman" w:cs="Times New Roman"/>
-          <w:sz w:val="20"/>
-          <w:szCs w:val="20"/>
-        </w:rPr>
-      </w:pPr>
-      <w:r>
-        <w:rPr>
-          <w:rFonts w:ascii="Times New Roman" w:hAnsi="Times New Roman" w:cs="Times New Roman"/>
-          <w:b/>
-          <w:bCs/>
-          <w:sz w:val="20"/>
-          <w:szCs w:val="20"/>
-        </w:rPr>
-        <w:lastRenderedPageBreak/>
-        <w:t xml:space="preserve">Laboratory Assistant | </w:t>
-      </w:r>
-      <w:r>
-        <w:rPr>
-          <w:rFonts w:ascii="Times New Roman" w:hAnsi="Times New Roman" w:cs="Times New Roman"/>
-          <w:sz w:val="20"/>
-          <w:szCs w:val="20"/>
-        </w:rPr>
-        <w:t>ERP Laboratory Telkom University</w:t>
-      </w:r>
-      <w:r>
-        <w:rPr>
-          <w:rFonts w:ascii="Times New Roman" w:hAnsi="Times New Roman" w:cs="Times New Roman"/>
-          <w:sz w:val="20"/>
-          <w:szCs w:val="20"/>
-        </w:rPr>
-        <w:tab/>
-        <w:t>March 2026 – Present</w:t>
+        <w:rPr>
+          <w:rFonts w:ascii="Times New Roman" w:hAnsi="Times New Roman" w:cs="Times New Roman"/>
+          <w:sz w:val="20"/>
+          <w:szCs w:val="20"/>
+        </w:rPr>
+      </w:pPr>
+      <w:r>
+        <w:rPr>
+          <w:rFonts w:ascii="Times New Roman" w:hAnsi="Times New Roman" w:cs="Times New Roman"/>
+          <w:sz w:val="20"/>
+          <w:szCs w:val="20"/>
+        </w:rPr>
+        <w:t>Developed and trained six deep learning architectures across whole-image and lesion-region inputs, including single-backbone, hybrid attention, multimodal, and mammography foundation models.</w:t>
       </w:r>
     </w:p>
     <w:p>
@@ -891,20 +893,89 @@
           <w:ilvl w:val="0"/>
           <w:numId w:val="3"/>
         </w:numPr>
-        <w:spacing w:after="0" w:line="240" w:lineRule="auto"/>
-        <w:rPr>
-          <w:rFonts w:ascii="Times New Roman" w:hAnsi="Times New Roman" w:cs="Times New Roman"/>
-          <w:sz w:val="20"/>
-          <w:szCs w:val="20"/>
-        </w:rPr>
-      </w:pPr>
-      <w:r>
-        <w:rPr>
-          <w:rFonts w:ascii="Times New Roman" w:hAnsi="Times New Roman" w:cs="Times New Roman"/>
-          <w:sz w:val="20"/>
-          <w:szCs w:val="20"/>
-        </w:rPr>
-        <w:t>Lead the Champions Teams work program, an initiative aimed at increasing competitive participation among 200+ Information Systems students through curated competition opportunities.</w:t>
+        <w:rPr>
+          <w:rFonts w:ascii="Times New Roman" w:hAnsi="Times New Roman" w:cs="Times New Roman"/>
+          <w:sz w:val="20"/>
+          <w:szCs w:val="20"/>
+        </w:rPr>
+      </w:pPr>
+      <w:r>
+        <w:rPr>
+          <w:rFonts w:ascii="Times New Roman" w:hAnsi="Times New Roman" w:cs="Times New Roman"/>
+          <w:sz w:val="20"/>
+          <w:szCs w:val="20"/>
+        </w:rPr>
+        <w:t>Configured controlled training and evaluation workflows using staged fine-tuning, mixed precision, gradient accumulation, and validation-based checkpoint and threshold selection.</w:t>
+      </w:r>
+    </w:p>
+    <w:p>
+      <w:pPr>
+        <w:pBdr>
+          <w:bottom w:val="single" w:sz="6" w:space="1" w:color="auto"/>
+        </w:pBdr>
+        <w:spacing w:after="0" w:line="240" w:lineRule="auto"/>
+        <w:rPr>
+          <w:rFonts w:ascii="Times New Roman" w:hAnsi="Times New Roman" w:cs="Times New Roman"/>
+          <w:b/>
+          <w:bCs/>
+        </w:rPr>
+      </w:pPr>
+      <w:r>
+        <w:rPr>
+          <w:rFonts w:ascii="Times New Roman" w:hAnsi="Times New Roman" w:cs="Times New Roman"/>
+          <w:b/>
+          <w:bCs/>
+          <w:lang w:val="en"/>
+        </w:rPr>
+        <w:t>ORGANIZATIONAL EXPERIENCE</w:t>
+      </w:r>
+      <w:r>
+        <w:rPr>
+          <w:rFonts w:ascii="Times New Roman" w:hAnsi="Times New Roman" w:cs="Times New Roman"/>
+          <w:b/>
+          <w:bCs/>
+        </w:rPr>
+        <w:t>S</w:t>
+      </w:r>
+    </w:p>
+    <w:p>
+      <w:pPr>
+        <w:tabs>
+          <w:tab w:val="right" w:pos="10466"/>
+        </w:tabs>
+        <w:spacing w:after="0" w:line="240" w:lineRule="auto"/>
+        <w:rPr>
+          <w:rFonts w:ascii="Times New Roman" w:hAnsi="Times New Roman" w:cs="Times New Roman"/>
+          <w:sz w:val="20"/>
+          <w:szCs w:val="20"/>
+        </w:rPr>
+      </w:pPr>
+      <w:r>
+        <w:rPr>
+          <w:rFonts w:ascii="Times New Roman" w:hAnsi="Times New Roman" w:cs="Times New Roman"/>
+          <w:b/>
+          <w:bCs/>
+          <w:sz w:val="20"/>
+          <w:szCs w:val="20"/>
+        </w:rPr>
+        <w:t xml:space="preserve">Full-Stack Developer | </w:t>
+      </w:r>
+      <w:r>
+        <w:rPr>
+          <w:rFonts w:ascii="Times New Roman" w:hAnsi="Times New Roman" w:cs="Times New Roman"/>
+          <w:sz w:val="20"/>
+          <w:szCs w:val="20"/>
+        </w:rPr>
+        <w:t>Central Computer Improvement (CCI) Telkom University</w:t>
+      </w:r>
+      <w:r>
+        <w:rPr>
+          <w:rFonts w:ascii="Times New Roman" w:hAnsi="Times New Roman" w:cs="Times New Roman"/>
+          <w:sz w:val="20"/>
+          <w:szCs w:val="20"/>
+        </w:rPr>
+        <w:tab/>
+        <w:t>February 2026 – Present</w:t>
       </w:r>
     </w:p>
     <w:p>
@@ -927,58 +998,7 @@
           <w:sz w:val="20"/>
           <w:szCs w:val="20"/>
         </w:rPr>
-        <w:t>Research, curate, and disseminate 10+ national and international competitions every month across Essay, Business Model Canvas, Design, IT, and Business Plan categories.</w:t>
-      </w:r>
-    </w:p>
-    <w:p>
-      <w:pPr>
-        <w:pStyle w:val="ListParagraph"/>
-        <w:spacing w:after="0" w:line="240" w:lineRule="auto"/>
-        <w:rPr>
-          <w:rFonts w:ascii="Times New Roman" w:hAnsi="Times New Roman" w:cs="Times New Roman"/>
-          <w:sz w:val="20"/>
-          <w:szCs w:val="20"/>
-        </w:rPr>
-      </w:pPr>
-    </w:p>
-    <w:p>
-      <w:pPr>
-        <w:tabs>
-          <w:tab w:val="right" w:pos="10466"/>
-        </w:tabs>
-        <w:spacing w:after="0" w:line="240" w:lineRule="auto"/>
-        <w:rPr>
-          <w:rFonts w:ascii="Times New Roman" w:hAnsi="Times New Roman" w:cs="Times New Roman"/>
-          <w:sz w:val="20"/>
-          <w:szCs w:val="20"/>
-        </w:rPr>
-      </w:pPr>
-      <w:r>
-        <w:rPr>
-          <w:rFonts w:ascii="Times New Roman" w:hAnsi="Times New Roman" w:cs="Times New Roman"/>
-          <w:b/>
-          <w:bCs/>
-          <w:sz w:val="20"/>
-          <w:szCs w:val="20"/>
-        </w:rPr>
-        <w:t xml:space="preserve">Sponsorship Staff | </w:t>
-      </w:r>
-      <w:r>
-        <w:rPr>
-          <w:rFonts w:ascii="Times New Roman" w:hAnsi="Times New Roman" w:cs="Times New Roman"/>
-          <w:sz w:val="20"/>
-          <w:szCs w:val="20"/>
-        </w:rPr>
-        <w:t>Telkom University National Futsal Championship</w:t>
-      </w:r>
-      <w:r>
-        <w:rPr>
-          <w:rFonts w:ascii="Times New Roman" w:hAnsi="Times New Roman" w:cs="Times New Roman"/>
-          <w:sz w:val="20"/>
-          <w:szCs w:val="20"/>
-        </w:rPr>
-        <w:tab/>
-        <w:t>December 2025 – May 2026</w:t>
+        <w:t>Served as backend developer on a 6-person engineering team building a vendor marketplace platform in partnership with UKM CSC, developing 90+ RESTful API endpoints using NestJS, PostgreSQL, and Prisma ORM. Authored full API documentation, tested endpoints with Postman, and configured Supabase, Midtrans payment gateway, SMTP, and Google OAuth integrations.</w:t>
       </w:r>
     </w:p>
     <w:p>
@@ -1001,7 +1021,59 @@
           <w:sz w:val="20"/>
           <w:szCs w:val="20"/>
         </w:rPr>
-        <w:t>Identified and approached 40+ potential corporate sponsors through targeted B2B outreach, conducting 15+ pitching sessions to companies and negotiating partnership agreements covering branding placements and event activation.</w:t>
+        <w:lastRenderedPageBreak/>
+        <w:t>Independently built a full stack document automation platform for Telkom University's student directorate, enabling 50+ student organizations to auto generate Proposal Kegiatan and LPJ documents, cutting processing time from 2+ hours to minutes. Designed the system from scratch with no predefined spec, replicated official templates via dompdf, and passed a penetration test from Telkom's PuTI Directorate before deployment.</w:t>
+      </w:r>
+    </w:p>
+    <w:p>
+      <w:pPr>
+        <w:pStyle w:val="ListParagraph"/>
+        <w:spacing w:after="0" w:line="240" w:lineRule="auto"/>
+        <w:rPr>
+          <w:rFonts w:ascii="Times New Roman" w:hAnsi="Times New Roman" w:cs="Times New Roman"/>
+          <w:sz w:val="20"/>
+          <w:szCs w:val="20"/>
+        </w:rPr>
+      </w:pPr>
+    </w:p>
+    <w:p>
+      <w:pPr>
+        <w:tabs>
+          <w:tab w:val="right" w:pos="10466"/>
+        </w:tabs>
+        <w:spacing w:after="0" w:line="240" w:lineRule="auto"/>
+        <w:rPr>
+          <w:rFonts w:ascii="Times New Roman" w:hAnsi="Times New Roman" w:cs="Times New Roman"/>
+          <w:sz w:val="20"/>
+          <w:szCs w:val="20"/>
+        </w:rPr>
+      </w:pPr>
+      <w:r>
+        <w:rPr>
+          <w:rFonts w:ascii="Times New Roman" w:hAnsi="Times New Roman" w:cs="Times New Roman"/>
+          <w:b/>
+          <w:bCs/>
+          <w:sz w:val="20"/>
+          <w:szCs w:val="20"/>
+        </w:rPr>
+        <w:t xml:space="preserve">Laboratory Assistant | </w:t>
+      </w:r>
+      <w:r>
+        <w:rPr>
+          <w:rFonts w:ascii="Times New Roman" w:hAnsi="Times New Roman" w:cs="Times New Roman"/>
+          <w:sz w:val="20"/>
+          <w:szCs w:val="20"/>
+        </w:rPr>
+        <w:t>ERP Laboratory Telkom University</w:t>
+      </w:r>
+      <w:r>
+        <w:rPr>
+          <w:rFonts w:ascii="Times New Roman" w:hAnsi="Times New Roman" w:cs="Times New Roman"/>
+          <w:sz w:val="20"/>
+          <w:szCs w:val="20"/>
+        </w:rPr>
+        <w:tab/>
+        <w:t>March 2026 – Present</w:t>
       </w:r>
     </w:p>
     <w:p>
@@ -1024,78 +1096,7 @@
           <w:sz w:val="20"/>
           <w:szCs w:val="20"/>
         </w:rPr>
-        <w:t>Established partnership agreements with multiple tenants and managed tenant coordination throughout the event, contributing to a 90% sponsorship slot fulfilment rate ahead of competition day.</w:t>
-      </w:r>
-    </w:p>
-    <w:p>
-      <w:pPr>
-        <w:spacing w:after="0" w:line="240" w:lineRule="auto"/>
-        <w:rPr>
-          <w:rFonts w:ascii="Times New Roman" w:hAnsi="Times New Roman" w:cs="Times New Roman"/>
-          <w:sz w:val="20"/>
-          <w:szCs w:val="20"/>
-        </w:rPr>
-      </w:pPr>
-    </w:p>
-    <w:p>
-      <w:pPr>
-        <w:pBdr>
-          <w:bottom w:val="single" w:sz="6" w:space="1" w:color="auto"/>
-        </w:pBdr>
-        <w:spacing w:after="0" w:line="240" w:lineRule="auto"/>
-        <w:rPr>
-          <w:rFonts w:ascii="Times New Roman" w:hAnsi="Times New Roman" w:cs="Times New Roman"/>
-          <w:b/>
-          <w:bCs/>
-        </w:rPr>
-      </w:pPr>
-      <w:r>
-        <w:rPr>
-          <w:rFonts w:ascii="Times New Roman" w:hAnsi="Times New Roman" w:cs="Times New Roman"/>
-          <w:b/>
-          <w:bCs/>
-        </w:rPr>
-        <w:t>PROJECTS</w:t>
-      </w:r>
-    </w:p>
-    <w:p>
-      <w:pPr>
-        <w:tabs>
-          <w:tab w:val="right" w:pos="10466"/>
-        </w:tabs>
-        <w:spacing w:after="0" w:line="240" w:lineRule="auto"/>
-        <w:rPr>
-          <w:rFonts w:ascii="Times New Roman" w:hAnsi="Times New Roman" w:cs="Times New Roman"/>
-          <w:sz w:val="20"/>
-          <w:szCs w:val="20"/>
-        </w:rPr>
-      </w:pPr>
-      <w:r>
-        <w:rPr>
-          <w:rFonts w:ascii="Times New Roman" w:hAnsi="Times New Roman" w:cs="Times New Roman"/>
-          <w:b/>
-          <w:bCs/>
-          <w:sz w:val="20"/>
-          <w:szCs w:val="20"/>
-        </w:rPr>
-        <w:t xml:space="preserve">KawanTuli | </w:t>
-      </w:r>
-      <w:r>
-        <w:rPr>
-          <w:rFonts w:ascii="Times New Roman" w:hAnsi="Times New Roman" w:cs="Times New Roman"/>
-          <w:sz w:val="20"/>
-          <w:szCs w:val="20"/>
-        </w:rPr>
-        <w:t>Capstone Project</w:t>
-      </w:r>
-      <w:r>
-        <w:rPr>
-          <w:rFonts w:ascii="Times New Roman" w:hAnsi="Times New Roman" w:cs="Times New Roman"/>
-          <w:sz w:val="20"/>
-          <w:szCs w:val="20"/>
-        </w:rPr>
-        <w:tab/>
-        <w:t> July 2026 - Present</w:t>
+        <w:t>Lead the Champions Teams work program, an initiative aimed at increasing competitive participation among 200+ Information Systems students through curated competition opportunities.</w:t>
       </w:r>
     </w:p>
     <w:p>
@@ -1105,19 +1106,92 @@
           <w:ilvl w:val="0"/>
           <w:numId w:val="3"/>
         </w:numPr>
-        <w:rPr>
-          <w:rFonts w:ascii="Times New Roman" w:hAnsi="Times New Roman" w:cs="Times New Roman"/>
-          <w:sz w:val="20"/>
-          <w:szCs w:val="20"/>
-        </w:rPr>
-      </w:pPr>
-      <w:r>
-        <w:rPr>
-          <w:rFonts w:ascii="Times New Roman" w:hAnsi="Times New Roman" w:cs="Times New Roman"/>
-          <w:sz w:val="20"/>
-          <w:szCs w:val="20"/>
-        </w:rPr>
-        <w:t>Developing KawanTuli, a BISINDO (Indonesian Sign Language) accessibility platform combining a two-way translator with an avatar-based learning system, built with Next.js, TypeScript, and TensorFlow.js, with all camera inference running on-device so no video ever leaves the browser.</w:t>
+        <w:spacing w:after="0" w:line="240" w:lineRule="auto"/>
+        <w:rPr>
+          <w:rFonts w:ascii="Times New Roman" w:hAnsi="Times New Roman" w:cs="Times New Roman"/>
+          <w:sz w:val="20"/>
+          <w:szCs w:val="20"/>
+        </w:rPr>
+      </w:pPr>
+      <w:r>
+        <w:rPr>
+          <w:rFonts w:ascii="Times New Roman" w:hAnsi="Times New Roman" w:cs="Times New Roman"/>
+          <w:sz w:val="20"/>
+          <w:szCs w:val="20"/>
+        </w:rPr>
+        <w:t>Research, curate, and disseminate 10+ national and international competitions every month across Essay, Business Model Canvas, Design, IT, and Business Plan categories.</w:t>
+      </w:r>
+    </w:p>
+    <w:p>
+      <w:pPr>
+        <w:pStyle w:val="ListParagraph"/>
+        <w:spacing w:after="0" w:line="240" w:lineRule="auto"/>
+        <w:rPr>
+          <w:rFonts w:ascii="Times New Roman" w:hAnsi="Times New Roman" w:cs="Times New Roman"/>
+          <w:sz w:val="20"/>
+          <w:szCs w:val="20"/>
+        </w:rPr>
+      </w:pPr>
+    </w:p>
+    <w:p>
+      <w:pPr>
+        <w:pBdr>
+          <w:bottom w:val="single" w:sz="6" w:space="1" w:color="auto"/>
+        </w:pBdr>
+        <w:spacing w:after="0" w:line="240" w:lineRule="auto"/>
+        <w:rPr>
+          <w:rFonts w:ascii="Times New Roman" w:hAnsi="Times New Roman" w:cs="Times New Roman"/>
+          <w:b/>
+          <w:bCs/>
+        </w:rPr>
+      </w:pPr>
+      <w:r>
+        <w:rPr>
+          <w:rFonts w:ascii="Times New Roman" w:hAnsi="Times New Roman" w:cs="Times New Roman"/>
+          <w:b/>
+          <w:bCs/>
+        </w:rPr>
+        <w:t>PROJECTS</w:t>
+      </w:r>
+    </w:p>
+    <w:p>
+      <w:pPr>
+        <w:tabs>
+          <w:tab w:val="right" w:pos="10466"/>
+        </w:tabs>
+        <w:spacing w:after="0" w:line="240" w:lineRule="auto"/>
+        <w:rPr>
+          <w:rFonts w:ascii="Times New Roman" w:hAnsi="Times New Roman" w:cs="Times New Roman"/>
+          <w:sz w:val="20"/>
+          <w:szCs w:val="20"/>
+        </w:rPr>
+      </w:pPr>
+      <w:r>
+        <w:rPr>
+          <w:rFonts w:ascii="Times New Roman" w:hAnsi="Times New Roman" w:cs="Times New Roman"/>
+          <w:b/>
+          <w:bCs/>
+          <w:sz w:val="20"/>
+          <w:szCs w:val="20"/>
+        </w:rPr>
+        <w:t xml:space="preserve">KawanTuli | </w:t>
+      </w:r>
+      <w:r>
+        <w:rPr>
+          <w:rFonts w:ascii="Times New Roman" w:hAnsi="Times New Roman" w:cs="Times New Roman"/>
+          <w:sz w:val="20"/>
+          <w:szCs w:val="20"/>
+        </w:rPr>
+        <w:t>Capstone Project</w:t>
+      </w:r>
+      <w:r>
+        <w:rPr>
+          <w:rFonts w:ascii="Times New Roman" w:hAnsi="Times New Roman" w:cs="Times New Roman"/>
+          <w:sz w:val="20"/>
+          <w:szCs w:val="20"/>
+        </w:rPr>
+        <w:tab/>
+        <w:t> July 2026 - Present</w:t>
       </w:r>
     </w:p>
     <w:p>
@@ -1127,20 +1201,19 @@
           <w:ilvl w:val="0"/>
           <w:numId w:val="3"/>
         </w:numPr>
-        <w:spacing w:after="0" w:line="240" w:lineRule="auto"/>
-        <w:rPr>
-          <w:rFonts w:ascii="Times New Roman" w:hAnsi="Times New Roman" w:cs="Times New Roman"/>
-          <w:sz w:val="20"/>
-          <w:szCs w:val="20"/>
-        </w:rPr>
-      </w:pPr>
-      <w:r>
-        <w:rPr>
-          <w:rFonts w:ascii="Times New Roman" w:hAnsi="Times New Roman" w:cs="Times New Roman"/>
-          <w:sz w:val="20"/>
-          <w:szCs w:val="20"/>
-        </w:rPr>
-        <w:t>Trained and deployed two recognition models: a 26-class alphabet classifier at 99.31% validation accuracy (~9,700 images), and a 32-class word-level 1D CNN at 83.13% signer-independent accuracy (1,600 videos), improved from 75.31% by fusing MediaPipe hand landmarks with arm pose features, running in real time at 15 fps with 6 ms median latency.</w:t>
+        <w:rPr>
+          <w:rFonts w:ascii="Times New Roman" w:hAnsi="Times New Roman" w:cs="Times New Roman"/>
+          <w:sz w:val="20"/>
+          <w:szCs w:val="20"/>
+        </w:rPr>
+      </w:pPr>
+      <w:r>
+        <w:rPr>
+          <w:rFonts w:ascii="Times New Roman" w:hAnsi="Times New Roman" w:cs="Times New Roman"/>
+          <w:sz w:val="20"/>
+          <w:szCs w:val="20"/>
+        </w:rPr>
+        <w:t>Developing KawanTuli, a BISINDO (Indonesian Sign Language) accessibility platform combining a two-way translator with an avatar-based learning system, built with Next.js, TypeScript, and TensorFlow.js, with all camera inference running on-device so no video ever leaves the browser.</w:t>
       </w:r>
     </w:p>
     <w:p>
@@ -1163,57 +1236,7 @@
           <w:sz w:val="20"/>
           <w:szCs w:val="20"/>
         </w:rPr>
-        <w:t>Built a rigged 3D avatar (react-three-fiber) that performs sign poses derived from dataset landmarks via analytic IK, plus two internal authoring tools enabling non-engineers to correct poses and re-record gestures via webcam.</w:t>
-      </w:r>
-    </w:p>
-    <w:p>
-      <w:pPr>
-        <w:spacing w:after="0" w:line="240" w:lineRule="auto"/>
-        <w:rPr>
-          <w:rFonts w:ascii="Times New Roman" w:hAnsi="Times New Roman" w:cs="Times New Roman"/>
-          <w:sz w:val="20"/>
-          <w:szCs w:val="20"/>
-        </w:rPr>
-      </w:pPr>
-    </w:p>
-    <w:p>
-      <w:pPr>
-        <w:tabs>
-          <w:tab w:val="right" w:pos="10466"/>
-        </w:tabs>
-        <w:spacing w:after="0" w:line="240" w:lineRule="auto"/>
-        <w:rPr>
-          <w:rFonts w:ascii="Times New Roman" w:hAnsi="Times New Roman" w:cs="Times New Roman"/>
-          <w:sz w:val="20"/>
-          <w:szCs w:val="20"/>
-        </w:rPr>
-      </w:pPr>
-      <w:r>
-        <w:rPr>
-          <w:rFonts w:ascii="Times New Roman" w:hAnsi="Times New Roman" w:cs="Times New Roman"/>
-          <w:b/>
-          <w:bCs/>
-          <w:sz w:val="20"/>
-          <w:szCs w:val="20"/>
-        </w:rPr>
-        <w:t xml:space="preserve">Mammography Benign vs Malignant Research Paper | </w:t>
-      </w:r>
-      <w:r>
-        <w:rPr>
-          <w:rFonts w:ascii="Times New Roman" w:hAnsi="Times New Roman" w:cs="Times New Roman"/>
-          <w:sz w:val="20"/>
-          <w:szCs w:val="20"/>
-        </w:rPr>
-        <w:t>HUMIC Engineering Research Center</w:t>
-      </w:r>
-      <w:r>
-        <w:rPr>
-          <w:rFonts w:ascii="Times New Roman" w:hAnsi="Times New Roman" w:cs="Times New Roman"/>
-          <w:sz w:val="20"/>
-          <w:szCs w:val="20"/>
-        </w:rPr>
-        <w:tab/>
-        <w:t>April 2026 – July 2026</w:t>
+        <w:t>Trained and deployed two recognition models: a 26-class alphabet classifier at 99.31% validation accuracy (~9,700 images), and a 32-class word-level 1D CNN at 83.13% signer-independent accuracy (1,600 videos), improved from 75.31% by fusing MediaPipe hand landmarks with arm pose features, running in real time at 15 fps with 6 ms median latency.</w:t>
       </w:r>
     </w:p>
     <w:p>
@@ -1223,19 +1246,70 @@
           <w:ilvl w:val="0"/>
           <w:numId w:val="3"/>
         </w:numPr>
-        <w:rPr>
-          <w:rFonts w:ascii="Times New Roman" w:hAnsi="Times New Roman" w:cs="Times New Roman"/>
-          <w:sz w:val="20"/>
-          <w:szCs w:val="20"/>
-        </w:rPr>
-      </w:pPr>
-      <w:r>
-        <w:rPr>
-          <w:rFonts w:ascii="Times New Roman" w:hAnsi="Times New Roman" w:cs="Times New Roman"/>
-          <w:sz w:val="20"/>
-          <w:szCs w:val="20"/>
-        </w:rPr>
-        <w:t>Within a 3-person team where each member independently trained and fine-tuned their own models, my leakage-free approach produced the best results and was selected as the team's final pipeline.</w:t>
+        <w:spacing w:after="0" w:line="240" w:lineRule="auto"/>
+        <w:rPr>
+          <w:rFonts w:ascii="Times New Roman" w:hAnsi="Times New Roman" w:cs="Times New Roman"/>
+          <w:sz w:val="20"/>
+          <w:szCs w:val="20"/>
+        </w:rPr>
+      </w:pPr>
+      <w:r>
+        <w:rPr>
+          <w:rFonts w:ascii="Times New Roman" w:hAnsi="Times New Roman" w:cs="Times New Roman"/>
+          <w:sz w:val="20"/>
+          <w:szCs w:val="20"/>
+        </w:rPr>
+        <w:t>Built a rigged 3D avatar (react-three-fiber) that performs sign poses derived from dataset landmarks via analytic IK, plus two internal authoring tools enabling non-engineers to correct poses and re-record gestures via webcam.</w:t>
+      </w:r>
+    </w:p>
+    <w:p>
+      <w:pPr>
+        <w:spacing w:after="0" w:line="240" w:lineRule="auto"/>
+        <w:rPr>
+          <w:rFonts w:ascii="Times New Roman" w:hAnsi="Times New Roman" w:cs="Times New Roman"/>
+          <w:sz w:val="20"/>
+          <w:szCs w:val="20"/>
+        </w:rPr>
+      </w:pPr>
+    </w:p>
+    <w:p>
+      <w:pPr>
+        <w:tabs>
+          <w:tab w:val="right" w:pos="10466"/>
+        </w:tabs>
+        <w:spacing w:after="0" w:line="240" w:lineRule="auto"/>
+        <w:rPr>
+          <w:rFonts w:ascii="Times New Roman" w:hAnsi="Times New Roman" w:cs="Times New Roman"/>
+          <w:sz w:val="20"/>
+          <w:szCs w:val="20"/>
+        </w:rPr>
+      </w:pPr>
+      <w:r>
+        <w:rPr>
+          <w:rFonts w:ascii="Times New Roman" w:hAnsi="Times New Roman" w:cs="Times New Roman"/>
+          <w:b/>
+          <w:bCs/>
+          <w:sz w:val="20"/>
+          <w:szCs w:val="20"/>
+        </w:rPr>
+        <w:t xml:space="preserve">AMANIN | </w:t>
+      </w:r>
+      <w:r>
+        <w:rPr>
+          <w:rFonts w:ascii="Times New Roman" w:hAnsi="Times New Roman" w:cs="Times New Roman"/>
+          <w:sz w:val="20"/>
+          <w:szCs w:val="20"/>
+        </w:rPr>
+        <w:t>Social Project</w:t>
+      </w:r>
+      <w:r>
+        <w:rPr>
+          <w:rFonts w:ascii="Times New Roman" w:hAnsi="Times New Roman" w:cs="Times New Roman"/>
+          <w:sz w:val="20"/>
+          <w:szCs w:val="20"/>
+        </w:rPr>
+        <w:tab/>
+        <w:t>April 2026 – May 2026</w:t>
       </w:r>
     </w:p>
     <w:p>
@@ -1245,19 +1319,20 @@
           <w:ilvl w:val="0"/>
           <w:numId w:val="3"/>
         </w:numPr>
-        <w:rPr>
-          <w:rFonts w:ascii="Times New Roman" w:hAnsi="Times New Roman" w:cs="Times New Roman"/>
-          <w:sz w:val="20"/>
-          <w:szCs w:val="20"/>
-        </w:rPr>
-      </w:pPr>
-      <w:r>
-        <w:rPr>
-          <w:rFonts w:ascii="Times New Roman" w:hAnsi="Times New Roman" w:cs="Times New Roman"/>
-          <w:sz w:val="20"/>
-          <w:szCs w:val="20"/>
-        </w:rPr>
-        <w:t>Built the winning solution end-to-end: a fair whole-image versus ROI comparison on CBIS-DDSM with patient-level splitting, benchmarking 6 architectures including a custom CBAM hybrid-fusion model and Mammo-CLIP across 12+ experiments.</w:t>
+        <w:spacing w:after="0" w:line="240" w:lineRule="auto"/>
+        <w:rPr>
+          <w:rFonts w:ascii="Times New Roman" w:hAnsi="Times New Roman" w:cs="Times New Roman"/>
+          <w:sz w:val="20"/>
+          <w:szCs w:val="20"/>
+        </w:rPr>
+      </w:pPr>
+      <w:r>
+        <w:rPr>
+          <w:rFonts w:ascii="Times New Roman" w:hAnsi="Times New Roman" w:cs="Times New Roman"/>
+          <w:sz w:val="20"/>
+          <w:szCs w:val="20"/>
+        </w:rPr>
+        <w:t>Developed AMANIN, an AI-powered image and video detection app designed to prevent media-based fraud by leveraging self-built deepfake detection models and digital forensic techniques, building the entire web application independently from end to end.</w:t>
       </w:r>
     </w:p>
     <w:p>
@@ -1267,83 +1342,20 @@
           <w:ilvl w:val="0"/>
           <w:numId w:val="3"/>
         </w:numPr>
-        <w:rPr>
-          <w:rFonts w:ascii="Times New Roman" w:hAnsi="Times New Roman" w:cs="Times New Roman"/>
-          <w:sz w:val="20"/>
-          <w:szCs w:val="20"/>
-        </w:rPr>
-      </w:pPr>
-      <w:r>
-        <w:rPr>
-          <w:rFonts w:ascii="Times New Roman" w:hAnsi="Times New Roman" w:cs="Times New Roman"/>
-          <w:sz w:val="20"/>
-          <w:szCs w:val="20"/>
-        </w:rPr>
-        <w:t xml:space="preserve">Pinpointed clinical metadata as the biggest lever (AUC 0.80 to 0.86) with Grad-CAM evidence of correct lesion </w:t>
-      </w:r>
-      <w:r>
-        <w:rPr>
-          <w:rFonts w:ascii="Times New Roman" w:hAnsi="Times New Roman" w:cs="Times New Roman"/>
-          <w:sz w:val="20"/>
-          <w:szCs w:val="20"/>
-        </w:rPr>
-        <w:t>focus and</w:t>
-      </w:r>
-      <w:r>
-        <w:rPr>
-          <w:rFonts w:ascii="Times New Roman" w:hAnsi="Times New Roman" w:cs="Times New Roman"/>
-          <w:sz w:val="20"/>
-          <w:szCs w:val="20"/>
-        </w:rPr>
-        <w:t xml:space="preserve"> authored the Methodology and Results and Discussion chapters of the resulting 6-page IEEE paper</w:t>
-      </w:r>
-      <w:r>
-        <w:rPr>
-          <w:rFonts w:ascii="Times New Roman" w:hAnsi="Times New Roman" w:cs="Times New Roman"/>
-          <w:sz w:val="20"/>
-          <w:szCs w:val="20"/>
-        </w:rPr>
-        <w:t>.</w:t>
-      </w:r>
-    </w:p>
-    <w:p>
-      <w:pPr>
-        <w:tabs>
-          <w:tab w:val="right" w:pos="10466"/>
-        </w:tabs>
-        <w:spacing w:after="0" w:line="240" w:lineRule="auto"/>
-        <w:rPr>
-          <w:rFonts w:ascii="Times New Roman" w:hAnsi="Times New Roman" w:cs="Times New Roman"/>
-          <w:sz w:val="20"/>
-          <w:szCs w:val="20"/>
-        </w:rPr>
-      </w:pPr>
-      <w:r>
-        <w:rPr>
-          <w:rFonts w:ascii="Times New Roman" w:hAnsi="Times New Roman" w:cs="Times New Roman"/>
-          <w:b/>
-          <w:bCs/>
-          <w:sz w:val="20"/>
-          <w:szCs w:val="20"/>
-        </w:rPr>
-        <w:t xml:space="preserve">AMANIN | </w:t>
-      </w:r>
-      <w:r>
-        <w:rPr>
-          <w:rFonts w:ascii="Times New Roman" w:hAnsi="Times New Roman" w:cs="Times New Roman"/>
-          <w:sz w:val="20"/>
-          <w:szCs w:val="20"/>
-        </w:rPr>
-        <w:t>Social Project</w:t>
-      </w:r>
-      <w:r>
-        <w:rPr>
-          <w:rFonts w:ascii="Times New Roman" w:hAnsi="Times New Roman" w:cs="Times New Roman"/>
-          <w:sz w:val="20"/>
-          <w:szCs w:val="20"/>
-        </w:rPr>
-        <w:tab/>
-        <w:t>April 2026 – May 2026</w:t>
+        <w:spacing w:after="0" w:line="240" w:lineRule="auto"/>
+        <w:rPr>
+          <w:rFonts w:ascii="Times New Roman" w:hAnsi="Times New Roman" w:cs="Times New Roman"/>
+          <w:sz w:val="20"/>
+          <w:szCs w:val="20"/>
+        </w:rPr>
+      </w:pPr>
+      <w:r>
+        <w:rPr>
+          <w:rFonts w:ascii="Times New Roman" w:hAnsi="Times New Roman" w:cs="Times New Roman"/>
+          <w:sz w:val="20"/>
+          <w:szCs w:val="20"/>
+        </w:rPr>
+        <w:t>Trained a custom deepfake detection model using PyTorch and OpenCV on a dataset of 10,000+ images and videos, achieving 90%+ detection accuracy in classifying AI-generated and manipulated media.</w:t>
       </w:r>
     </w:p>
     <w:p>
@@ -1366,7 +1378,57 @@
           <w:sz w:val="20"/>
           <w:szCs w:val="20"/>
         </w:rPr>
-        <w:t>Developed AMANIN, an AI-powered image and video detection app designed to prevent media-based fraud by leveraging self-built deepfake detection models and digital forensic techniques, building the entire web application independently from end to end.</w:t>
+        <w:t>Delivered as a social impact initiative educating 40+ residents across 1 rural village, raising community awareness of the dangers of fraud using AI-generated images and videos and equipping them to recognize manipulated media.</w:t>
+      </w:r>
+    </w:p>
+    <w:p>
+      <w:pPr>
+        <w:spacing w:after="0" w:line="240" w:lineRule="auto"/>
+        <w:rPr>
+          <w:rFonts w:ascii="Times New Roman" w:hAnsi="Times New Roman" w:cs="Times New Roman"/>
+          <w:sz w:val="20"/>
+          <w:szCs w:val="20"/>
+        </w:rPr>
+      </w:pPr>
+    </w:p>
+    <w:p>
+      <w:pPr>
+        <w:tabs>
+          <w:tab w:val="right" w:pos="10466"/>
+        </w:tabs>
+        <w:spacing w:after="0" w:line="240" w:lineRule="auto"/>
+        <w:rPr>
+          <w:rFonts w:ascii="Times New Roman" w:hAnsi="Times New Roman" w:cs="Times New Roman"/>
+          <w:sz w:val="20"/>
+          <w:szCs w:val="20"/>
+        </w:rPr>
+      </w:pPr>
+      <w:r>
+        <w:rPr>
+          <w:rFonts w:ascii="Times New Roman" w:hAnsi="Times New Roman" w:cs="Times New Roman"/>
+          <w:b/>
+          <w:bCs/>
+          <w:sz w:val="20"/>
+          <w:szCs w:val="20"/>
+        </w:rPr>
+        <w:t xml:space="preserve">MLCRAFT | </w:t>
+      </w:r>
+      <w:r>
+        <w:rPr>
+          <w:rFonts w:ascii="Times New Roman" w:hAnsi="Times New Roman" w:cs="Times New Roman"/>
+          <w:sz w:val="20"/>
+          <w:szCs w:val="20"/>
+        </w:rPr>
+        <w:t>Open-Source AI/ML Engineering Plugin</w:t>
+      </w:r>
+      <w:r>
+        <w:rPr>
+          <w:rFonts w:ascii="Times New Roman" w:hAnsi="Times New Roman" w:cs="Times New Roman"/>
+          <w:sz w:val="20"/>
+          <w:szCs w:val="20"/>
+        </w:rPr>
+        <w:tab/>
+        <w:t> July 2026</w:t>
       </w:r>
     </w:p>
     <w:p>
@@ -1376,20 +1438,19 @@
           <w:ilvl w:val="0"/>
           <w:numId w:val="3"/>
         </w:numPr>
-        <w:spacing w:after="0" w:line="240" w:lineRule="auto"/>
-        <w:rPr>
-          <w:rFonts w:ascii="Times New Roman" w:hAnsi="Times New Roman" w:cs="Times New Roman"/>
-          <w:sz w:val="20"/>
-          <w:szCs w:val="20"/>
-        </w:rPr>
-      </w:pPr>
-      <w:r>
-        <w:rPr>
-          <w:rFonts w:ascii="Times New Roman" w:hAnsi="Times New Roman" w:cs="Times New Roman"/>
-          <w:sz w:val="20"/>
-          <w:szCs w:val="20"/>
-        </w:rPr>
-        <w:t>Trained a custom deepfake detection model from scratch using PyTorch and OpenCV on a dataset of 10,000+ images and videos, achieving 90%+ detection accuracy in classifying AI-generated and manipulated media.</w:t>
+        <w:rPr>
+          <w:rFonts w:ascii="Times New Roman" w:hAnsi="Times New Roman" w:cs="Times New Roman"/>
+          <w:sz w:val="20"/>
+          <w:szCs w:val="20"/>
+        </w:rPr>
+      </w:pPr>
+      <w:r>
+        <w:rPr>
+          <w:rFonts w:ascii="Times New Roman" w:hAnsi="Times New Roman" w:cs="Times New Roman"/>
+          <w:sz w:val="20"/>
+          <w:szCs w:val="20"/>
+        </w:rPr>
+        <w:t>Built mlcraft, an open-source plugin that turns AI coding assistants (Claude Code, Antigravity) into a senior AI/ML research engineer, packaging 23 skills that auto-route a plain-language task to the best method across 14 domains including computer vision, medical imaging, NLP and LLM, tabular, time-series, generative, reinforcement learning, graph, multimodal, video, and 3D.</w:t>
       </w:r>
     </w:p>
     <w:p>
@@ -1412,11 +1473,12 @@
           <w:sz w:val="20"/>
           <w:szCs w:val="20"/>
         </w:rPr>
-        <w:t>Delivered as a social impact initiative educating 40+ residents across 1 rural village, raising community awareness of the dangers of fraud using AI-generated images and videos and equipping them to recognize manipulated media.</w:t>
-      </w:r>
-    </w:p>
-    <w:p>
-      <w:pPr>
+        <w:t>Encoded a research-first, leakage-aware workflow grounded in 2021 to 2026 literature: paper review with realistic-ceiling estimation, group, patient, and temporal split audits, per-problem metric and explainability selection (ROC-AUC vs mAP vs RMSE, Grad-CAM vs bounding boxes vs SHAP), and an iterative accuracy-improvement loop.</w:t>
+      </w:r>
+    </w:p>
+    <w:p>
+      <w:pPr>
+        <w:pStyle w:val="ListParagraph"/>
         <w:spacing w:after="0" w:line="240" w:lineRule="auto"/>
         <w:rPr>
           <w:rFonts w:ascii="Times New Roman" w:hAnsi="Times New Roman" w:cs="Times New Roman"/>
@@ -1445,15 +1507,23 @@
           <w:sz w:val="20"/>
           <w:szCs w:val="20"/>
         </w:rPr>
-        <w:t xml:space="preserve">MLCRAFT | </w:t>
-      </w:r>
-      <w:r>
-        <w:rPr>
-          <w:rFonts w:ascii="Times New Roman" w:hAnsi="Times New Roman" w:cs="Times New Roman"/>
-          <w:sz w:val="20"/>
-          <w:szCs w:val="20"/>
-        </w:rPr>
-        <w:t>Open-Source AI/ML Engineering Plugin</w:t>
+        <w:t xml:space="preserve">KKA-DRAFT | </w:t>
+      </w:r>
+      <w:r>
+        <w:rPr>
+          <w:rFonts w:ascii="Times New Roman" w:hAnsi="Times New Roman" w:cs="Times New Roman"/>
+          <w:sz w:val="20"/>
+          <w:szCs w:val="20"/>
+        </w:rPr>
+        <w:t>Telkom University Student Directorate</w:t>
+      </w:r>
+      <w:r>
+        <w:rPr>
+          <w:rFonts w:ascii="Times New Roman" w:hAnsi="Times New Roman" w:cs="Times New Roman"/>
+          <w:sz w:val="20"/>
+          <w:szCs w:val="20"/>
+        </w:rPr>
+        <w:t xml:space="preserve"> </w:t>
       </w:r>
       <w:r>
         <w:rPr>
@@ -1462,7 +1532,14 @@
           <w:szCs w:val="20"/>
         </w:rPr>
         <w:tab/>
-        <w:t> July 2026</w:t>
+      </w:r>
+      <w:r>
+        <w:rPr>
+          <w:rFonts w:ascii="Times New Roman" w:hAnsi="Times New Roman" w:cs="Times New Roman"/>
+          <w:sz w:val="20"/>
+          <w:szCs w:val="20"/>
+        </w:rPr>
+        <w:t>April 2026 – June 2026</w:t>
       </w:r>
     </w:p>
     <w:p>
@@ -1472,19 +1549,20 @@
           <w:ilvl w:val="0"/>
           <w:numId w:val="3"/>
         </w:numPr>
-        <w:rPr>
-          <w:rFonts w:ascii="Times New Roman" w:hAnsi="Times New Roman" w:cs="Times New Roman"/>
-          <w:sz w:val="20"/>
-          <w:szCs w:val="20"/>
-        </w:rPr>
-      </w:pPr>
-      <w:r>
-        <w:rPr>
-          <w:rFonts w:ascii="Times New Roman" w:hAnsi="Times New Roman" w:cs="Times New Roman"/>
-          <w:sz w:val="20"/>
-          <w:szCs w:val="20"/>
-        </w:rPr>
-        <w:t>Built mlcraft, an open-source plugin that turns AI coding assistants (Claude Code, Antigravity) into a senior AI/ML research engineer, packaging 23 skills that auto-route a plain-language task to the best method across 14 domains including computer vision, medical imaging, NLP and LLM, tabular, time-series, generative, reinforcement learning, graph, multimodal, video, and 3D.</w:t>
+        <w:spacing w:after="0" w:line="240" w:lineRule="auto"/>
+        <w:rPr>
+          <w:rFonts w:ascii="Times New Roman" w:hAnsi="Times New Roman" w:cs="Times New Roman"/>
+          <w:sz w:val="20"/>
+          <w:szCs w:val="20"/>
+        </w:rPr>
+      </w:pPr>
+      <w:r>
+        <w:rPr>
+          <w:rFonts w:ascii="Times New Roman" w:hAnsi="Times New Roman" w:cs="Times New Roman"/>
+          <w:sz w:val="20"/>
+          <w:szCs w:val="20"/>
+        </w:rPr>
+        <w:t>Internal tool for Telkom University’s student directorate enabling UKMs and student organizations to generate official Proposal Kegiatan and LPJ documents without the chaos of manual formatting.</w:t>
       </w:r>
     </w:p>
     <w:p>
@@ -1507,58 +1585,7 @@
           <w:sz w:val="20"/>
           <w:szCs w:val="20"/>
         </w:rPr>
-        <w:t>Encoded a research-first, leakage-aware workflow grounded in 2021 to 2026 literature: paper review with realistic-ceiling estimation, group, patient, and temporal split audits, per-problem metric and explainability selection (ROC-AUC vs mAP vs RMSE, Grad-CAM vs bounding boxes vs SHAP), and an iterative accuracy-improvement loop.</w:t>
-      </w:r>
-    </w:p>
-    <w:p>
-      <w:pPr>
-        <w:pStyle w:val="ListParagraph"/>
-        <w:spacing w:after="0" w:line="240" w:lineRule="auto"/>
-        <w:rPr>
-          <w:rFonts w:ascii="Times New Roman" w:hAnsi="Times New Roman" w:cs="Times New Roman"/>
-          <w:sz w:val="20"/>
-          <w:szCs w:val="20"/>
-        </w:rPr>
-      </w:pPr>
-    </w:p>
-    <w:p>
-      <w:pPr>
-        <w:tabs>
-          <w:tab w:val="right" w:pos="10466"/>
-        </w:tabs>
-        <w:spacing w:after="0" w:line="240" w:lineRule="auto"/>
-        <w:rPr>
-          <w:rFonts w:ascii="Times New Roman" w:hAnsi="Times New Roman" w:cs="Times New Roman"/>
-          <w:sz w:val="20"/>
-          <w:szCs w:val="20"/>
-        </w:rPr>
-      </w:pPr>
-      <w:r>
-        <w:rPr>
-          <w:rFonts w:ascii="Times New Roman" w:hAnsi="Times New Roman" w:cs="Times New Roman"/>
-          <w:b/>
-          <w:bCs/>
-          <w:sz w:val="20"/>
-          <w:szCs w:val="20"/>
-        </w:rPr>
-        <w:t xml:space="preserve">GAP | </w:t>
-      </w:r>
-      <w:r>
-        <w:rPr>
-          <w:rFonts w:ascii="Times New Roman" w:hAnsi="Times New Roman" w:cs="Times New Roman"/>
-          <w:sz w:val="20"/>
-          <w:szCs w:val="20"/>
-        </w:rPr>
-        <w:t>Personal Project</w:t>
-      </w:r>
-      <w:r>
-        <w:rPr>
-          <w:rFonts w:ascii="Times New Roman" w:hAnsi="Times New Roman" w:cs="Times New Roman"/>
-          <w:sz w:val="20"/>
-          <w:szCs w:val="20"/>
-        </w:rPr>
-        <w:tab/>
-        <w:t>May 2026 – June</w:t>
+        <w:t>Delivered under a 3 month self-imposed sprint with full creative freedom and no predefined specification, with every design decision, feature, and UI flow owned end-to-end from scratch.</w:t>
       </w:r>
     </w:p>
     <w:p>
@@ -1581,7 +1608,117 @@
           <w:sz w:val="20"/>
           <w:szCs w:val="20"/>
         </w:rPr>
-        <w:t>Developing GAP, an API intelligence platform built with TypeScript that auto-detects routes, request bodies, and backend-to-frontend contract mismatches directly from source code, leveraging Retrieval-Augmented Generation (RAG) and Regular Expressions, with zero annotations and zero manual documentation required.</w:t>
+        <w:t>Solved complex PDF rendering with dompdf including multi-page layouts, embedded tables, signatures, logos, and pixel-accurate formatting, replacing a previously manual process used across 50+ campus organizations.</w:t>
+      </w:r>
+    </w:p>
+    <w:p>
+      <w:pPr>
+        <w:pStyle w:val="ListParagraph"/>
+        <w:spacing w:after="0" w:line="240" w:lineRule="auto"/>
+        <w:rPr>
+          <w:rFonts w:ascii="Times New Roman" w:hAnsi="Times New Roman" w:cs="Times New Roman"/>
+          <w:sz w:val="20"/>
+          <w:szCs w:val="20"/>
+        </w:rPr>
+      </w:pPr>
+    </w:p>
+    <w:p>
+      <w:pPr>
+        <w:pBdr>
+          <w:bottom w:val="single" w:sz="6" w:space="1" w:color="auto"/>
+        </w:pBdr>
+        <w:spacing w:after="0" w:line="240" w:lineRule="auto"/>
+        <w:rPr>
+          <w:rFonts w:ascii="Times New Roman" w:hAnsi="Times New Roman" w:cs="Times New Roman"/>
+          <w:b/>
+          <w:bCs/>
+        </w:rPr>
+      </w:pPr>
+      <w:r>
+        <w:rPr>
+          <w:rFonts w:ascii="Times New Roman" w:hAnsi="Times New Roman" w:cs="Times New Roman"/>
+          <w:b/>
+          <w:bCs/>
+        </w:rPr>
+        <w:t>PUBLICATION</w:t>
+      </w:r>
+    </w:p>
+    <w:p>
+      <w:pPr>
+        <w:spacing w:after="0" w:line="240" w:lineRule="auto"/>
+        <w:ind w:right="-24"/>
+        <w:rPr>
+          <w:rFonts w:ascii="Times New Roman" w:hAnsi="Times New Roman" w:cs="Times New Roman"/>
+          <w:b/>
+          <w:bCs/>
+          <w:sz w:val="20"/>
+          <w:szCs w:val="20"/>
+        </w:rPr>
+      </w:pPr>
+      <w:r>
+        <w:rPr>
+          <w:rFonts w:ascii="Times New Roman" w:hAnsi="Times New Roman" w:cs="Times New Roman"/>
+          <w:b/>
+          <w:bCs/>
+          <w:sz w:val="20"/>
+          <w:szCs w:val="20"/>
+        </w:rPr>
+        <w:t>Controlled Comparison of Multimodal Hybrid Deep Learning for Benign-Malignant Mammogram Classification on CBIS-DDSM</w:t>
+      </w:r>
+    </w:p>
+    <w:p>
+      <w:pPr>
+        <w:spacing w:after="0" w:line="240" w:lineRule="auto"/>
+        <w:ind w:right="-24"/>
+        <w:rPr>
+          <w:rFonts w:ascii="Times New Roman" w:hAnsi="Times New Roman" w:cs="Times New Roman"/>
+          <w:sz w:val="20"/>
+          <w:szCs w:val="20"/>
+        </w:rPr>
+      </w:pPr>
+      <w:r>
+        <w:rPr>
+          <w:rFonts w:ascii="Times New Roman" w:hAnsi="Times New Roman" w:cs="Times New Roman"/>
+          <w:sz w:val="20"/>
+          <w:szCs w:val="20"/>
+        </w:rPr>
+        <w:t xml:space="preserve">First Author | JADIMI: Journal of AI-Driven Informatics and Management Information </w:t>
+      </w:r>
+      <w:r>
+        <w:rPr>
+          <w:rFonts w:ascii="Times New Roman" w:hAnsi="Times New Roman" w:cs="Times New Roman"/>
+          <w:sz w:val="20"/>
+          <w:szCs w:val="20"/>
+        </w:rPr>
+        <w:tab/>
+      </w:r>
+      <w:r>
+        <w:rPr>
+          <w:rFonts w:ascii="Times New Roman" w:hAnsi="Times New Roman" w:cs="Times New Roman"/>
+          <w:sz w:val="20"/>
+          <w:szCs w:val="20"/>
+        </w:rPr>
+        <w:tab/>
+      </w:r>
+      <w:r>
+        <w:rPr>
+          <w:rFonts w:ascii="Times New Roman" w:hAnsi="Times New Roman" w:cs="Times New Roman"/>
+          <w:sz w:val="20"/>
+          <w:szCs w:val="20"/>
+        </w:rPr>
+        <w:tab/>
+      </w:r>
+      <w:r>
+        <w:rPr>
+          <w:rFonts w:ascii="Times New Roman" w:hAnsi="Times New Roman" w:cs="Times New Roman"/>
+          <w:sz w:val="20"/>
+          <w:szCs w:val="20"/>
+        </w:rPr>
+        <w:tab/>
+        <w:t xml:space="preserve">  August 2026</w:t>
+      </w:r>
+      <w:r>
+        <w:t xml:space="preserve"> </w:t>
       </w:r>
     </w:p>
     <w:p>
@@ -1589,22 +1726,23 @@
         <w:pStyle w:val="ListParagraph"/>
         <w:numPr>
           <w:ilvl w:val="0"/>
-          <w:numId w:val="3"/>
+          <w:numId w:val="8"/>
         </w:numPr>
         <w:spacing w:after="0" w:line="240" w:lineRule="auto"/>
-        <w:rPr>
-          <w:rFonts w:ascii="Times New Roman" w:hAnsi="Times New Roman" w:cs="Times New Roman"/>
-          <w:sz w:val="20"/>
-          <w:szCs w:val="20"/>
-        </w:rPr>
-      </w:pPr>
-      <w:r>
-        <w:rPr>
-          <w:rFonts w:ascii="Times New Roman" w:hAnsi="Times New Roman" w:cs="Times New Roman"/>
-          <w:sz w:val="20"/>
-          <w:szCs w:val="20"/>
-        </w:rPr>
-        <w:t>Designed the core engine that parses entire codebases and generates a full API map in seconds, targeting engineering teams who struggle with undocumented or out-of-sync APIs across services.</w:t>
+        <w:ind w:right="-24"/>
+        <w:rPr>
+          <w:rFonts w:ascii="Times New Roman" w:hAnsi="Times New Roman" w:cs="Times New Roman"/>
+          <w:sz w:val="20"/>
+          <w:szCs w:val="20"/>
+        </w:rPr>
+      </w:pPr>
+      <w:r>
+        <w:rPr>
+          <w:rFonts w:ascii="Times New Roman" w:hAnsi="Times New Roman" w:cs="Times New Roman"/>
+          <w:sz w:val="20"/>
+          <w:szCs w:val="20"/>
+        </w:rPr>
+        <w:t>Identified clinical metadata fusion as the largest source of performance improvement, increasing hybrid-model test AUC from 0.797 to 0.856 on lesion regions and 0.785 to 0.845 on whole mammograms.</w:t>
       </w:r>
     </w:p>
     <w:p>
@@ -1612,33 +1750,85 @@
         <w:pStyle w:val="ListParagraph"/>
         <w:numPr>
           <w:ilvl w:val="0"/>
-          <w:numId w:val="3"/>
+          <w:numId w:val="8"/>
         </w:numPr>
         <w:spacing w:after="0" w:line="240" w:lineRule="auto"/>
-        <w:rPr>
-          <w:rFonts w:ascii="Times New Roman" w:hAnsi="Times New Roman" w:cs="Times New Roman"/>
-          <w:sz w:val="20"/>
-          <w:szCs w:val="20"/>
-        </w:rPr>
-      </w:pPr>
-      <w:r>
-        <w:rPr>
-          <w:rFonts w:ascii="Times New Roman" w:hAnsi="Times New Roman" w:cs="Times New Roman"/>
-          <w:sz w:val="20"/>
-          <w:szCs w:val="20"/>
-        </w:rPr>
-        <w:t>In active development with open feedback loops from peer engineering teams.</w:t>
-      </w:r>
-    </w:p>
-    <w:p>
-      <w:pPr>
-        <w:spacing w:after="0" w:line="240" w:lineRule="auto"/>
-        <w:rPr>
-          <w:rFonts w:ascii="Times New Roman" w:hAnsi="Times New Roman" w:cs="Times New Roman"/>
-          <w:sz w:val="20"/>
-          <w:szCs w:val="20"/>
-        </w:rPr>
-      </w:pPr>
+        <w:ind w:right="-24"/>
+        <w:rPr>
+          <w:rFonts w:ascii="Times New Roman" w:hAnsi="Times New Roman" w:cs="Times New Roman"/>
+          <w:sz w:val="20"/>
+          <w:szCs w:val="20"/>
+        </w:rPr>
+      </w:pPr>
+      <w:r>
+        <w:rPr>
+          <w:rFonts w:ascii="Times New Roman" w:hAnsi="Times New Roman" w:cs="Times New Roman"/>
+          <w:sz w:val="20"/>
+          <w:szCs w:val="20"/>
+        </w:rPr>
+        <w:t>Developed the study’s highest-AUC ROI configuration by combining EfficientNet-B3, ConvNeXt-Tiny, gated fusion, CBAM attention, and seven clinical descriptors under a controlled evaluation protocol.</w:t>
+      </w:r>
+      <w:r>
+        <w:rPr>
+          <w:rFonts w:ascii="Times New Roman" w:hAnsi="Times New Roman" w:cs="Times New Roman"/>
+          <w:sz w:val="20"/>
+          <w:szCs w:val="20"/>
+        </w:rPr>
+        <w:tab/>
+      </w:r>
+    </w:p>
+    <w:p>
+      <w:pPr>
+        <w:pStyle w:val="ListParagraph"/>
+        <w:spacing w:after="0" w:line="240" w:lineRule="auto"/>
+        <w:ind w:right="-24"/>
+        <w:rPr>
+          <w:rFonts w:ascii="Times New Roman" w:hAnsi="Times New Roman" w:cs="Times New Roman"/>
+          <w:sz w:val="20"/>
+          <w:szCs w:val="20"/>
+        </w:rPr>
+      </w:pPr>
+      <w:r>
+        <w:rPr>
+          <w:rFonts w:ascii="Times New Roman" w:hAnsi="Times New Roman" w:cs="Times New Roman"/>
+          <w:b/>
+          <w:bCs/>
+          <w:sz w:val="20"/>
+          <w:szCs w:val="20"/>
+        </w:rPr>
+        <w:tab/>
+      </w:r>
+      <w:r>
+        <w:rPr>
+          <w:rFonts w:ascii="Times New Roman" w:hAnsi="Times New Roman" w:cs="Times New Roman"/>
+          <w:b/>
+          <w:bCs/>
+          <w:sz w:val="20"/>
+          <w:szCs w:val="20"/>
+        </w:rPr>
+        <w:tab/>
+      </w:r>
+    </w:p>
+    <w:p>
+      <w:pPr>
+        <w:pBdr>
+          <w:bottom w:val="single" w:sz="6" w:space="1" w:color="auto"/>
+        </w:pBdr>
+        <w:spacing w:after="0" w:line="240" w:lineRule="auto"/>
+        <w:rPr>
+          <w:rFonts w:ascii="Times New Roman" w:hAnsi="Times New Roman" w:cs="Times New Roman"/>
+          <w:b/>
+          <w:bCs/>
+        </w:rPr>
+      </w:pPr>
+      <w:r>
+        <w:rPr>
+          <w:rFonts w:ascii="Times New Roman" w:hAnsi="Times New Roman" w:cs="Times New Roman"/>
+          <w:b/>
+          <w:bCs/>
+        </w:rPr>
+        <w:t>HONORS &amp; AWARDS</w:t>
+      </w:r>
     </w:p>
     <w:p>
       <w:pPr>
@@ -1660,15 +1850,7 @@
           <w:sz w:val="20"/>
           <w:szCs w:val="20"/>
         </w:rPr>
-        <w:t xml:space="preserve">KKA-DRAFT | </w:t>
-      </w:r>
-      <w:r>
-        <w:rPr>
-          <w:rFonts w:ascii="Times New Roman" w:hAnsi="Times New Roman" w:cs="Times New Roman"/>
-          <w:sz w:val="20"/>
-          <w:szCs w:val="20"/>
-        </w:rPr>
-        <w:t>Telkom University Student Directorate</w:t>
+        <w:t>Finalist</w:t>
       </w:r>
       <w:r>
         <w:rPr>
@@ -1677,109 +1859,25 @@
           <w:szCs w:val="20"/>
         </w:rPr>
         <w:tab/>
-        <w:t>April 2026 – June 2026</w:t>
-      </w:r>
-    </w:p>
-    <w:p>
-      <w:pPr>
-        <w:pStyle w:val="ListParagraph"/>
-        <w:numPr>
-          <w:ilvl w:val="0"/>
-          <w:numId w:val="3"/>
-        </w:numPr>
-        <w:spacing w:after="0" w:line="240" w:lineRule="auto"/>
-        <w:rPr>
-          <w:rFonts w:ascii="Times New Roman" w:hAnsi="Times New Roman" w:cs="Times New Roman"/>
-          <w:sz w:val="20"/>
-          <w:szCs w:val="20"/>
-        </w:rPr>
-      </w:pPr>
-      <w:r>
-        <w:rPr>
-          <w:rFonts w:ascii="Times New Roman" w:hAnsi="Times New Roman" w:cs="Times New Roman"/>
-          <w:sz w:val="20"/>
-          <w:szCs w:val="20"/>
-        </w:rPr>
-        <w:t>Internal tool for Telkom University’s student directorate enabling UKMs and student organizations to generate official Proposal Kegiatan and LPJ documents without the chaos of manual formatting.</w:t>
-      </w:r>
-    </w:p>
-    <w:p>
-      <w:pPr>
-        <w:pStyle w:val="ListParagraph"/>
-        <w:numPr>
-          <w:ilvl w:val="0"/>
-          <w:numId w:val="3"/>
-        </w:numPr>
-        <w:spacing w:after="0" w:line="240" w:lineRule="auto"/>
-        <w:rPr>
-          <w:rFonts w:ascii="Times New Roman" w:hAnsi="Times New Roman" w:cs="Times New Roman"/>
-          <w:sz w:val="20"/>
-          <w:szCs w:val="20"/>
-        </w:rPr>
-      </w:pPr>
-      <w:r>
-        <w:rPr>
-          <w:rFonts w:ascii="Times New Roman" w:hAnsi="Times New Roman" w:cs="Times New Roman"/>
-          <w:sz w:val="20"/>
-          <w:szCs w:val="20"/>
-        </w:rPr>
-        <w:lastRenderedPageBreak/>
-        <w:t>Delivered under a 3 month self-imposed sprint with full creative freedom and no predefined specification, with every design decision, feature, and UI flow owned end-to-end from scratch.</w:t>
-      </w:r>
-    </w:p>
-    <w:p>
-      <w:pPr>
-        <w:pStyle w:val="ListParagraph"/>
-        <w:numPr>
-          <w:ilvl w:val="0"/>
-          <w:numId w:val="3"/>
-        </w:numPr>
-        <w:spacing w:after="0" w:line="240" w:lineRule="auto"/>
-        <w:rPr>
-          <w:rFonts w:ascii="Times New Roman" w:hAnsi="Times New Roman" w:cs="Times New Roman"/>
-          <w:sz w:val="20"/>
-          <w:szCs w:val="20"/>
-        </w:rPr>
-      </w:pPr>
-      <w:r>
-        <w:rPr>
-          <w:rFonts w:ascii="Times New Roman" w:hAnsi="Times New Roman" w:cs="Times New Roman"/>
-          <w:sz w:val="20"/>
-          <w:szCs w:val="20"/>
-        </w:rPr>
-        <w:t>Solved complex PDF rendering with dompdf including multi-page layouts, embedded tables, signatures, logos, and pixel-accurate formatting, replacing a previously manual process used across 50+ campus organizations.</w:t>
-      </w:r>
-    </w:p>
-    <w:p>
-      <w:pPr>
-        <w:pStyle w:val="ListParagraph"/>
-        <w:spacing w:after="0" w:line="240" w:lineRule="auto"/>
-        <w:rPr>
-          <w:rFonts w:ascii="Times New Roman" w:hAnsi="Times New Roman" w:cs="Times New Roman"/>
-          <w:sz w:val="20"/>
-          <w:szCs w:val="20"/>
-        </w:rPr>
-      </w:pPr>
-    </w:p>
-    <w:p>
-      <w:pPr>
-        <w:pBdr>
-          <w:bottom w:val="single" w:sz="6" w:space="1" w:color="auto"/>
-        </w:pBdr>
-        <w:spacing w:after="0" w:line="240" w:lineRule="auto"/>
-        <w:rPr>
-          <w:rFonts w:ascii="Times New Roman" w:hAnsi="Times New Roman" w:cs="Times New Roman"/>
-          <w:b/>
-          <w:bCs/>
-        </w:rPr>
-      </w:pPr>
-      <w:r>
-        <w:rPr>
-          <w:rFonts w:ascii="Times New Roman" w:hAnsi="Times New Roman" w:cs="Times New Roman"/>
-          <w:b/>
-          <w:bCs/>
-        </w:rPr>
-        <w:t>HONORS &amp; AWARDS</w:t>
+        <w:t>July 2026</w:t>
+      </w:r>
+    </w:p>
+    <w:p>
+      <w:pPr>
+        <w:spacing w:after="0" w:line="240" w:lineRule="auto"/>
+        <w:rPr>
+          <w:rFonts w:ascii="Times New Roman" w:hAnsi="Times New Roman" w:cs="Times New Roman"/>
+          <w:sz w:val="20"/>
+          <w:szCs w:val="20"/>
+        </w:rPr>
+      </w:pPr>
+      <w:r>
+        <w:rPr>
+          <w:rFonts w:ascii="Times New Roman" w:hAnsi="Times New Roman" w:cs="Times New Roman"/>
+          <w:sz w:val="20"/>
+          <w:szCs w:val="20"/>
+        </w:rPr>
+        <w:t>OpenAI Build Week Hackathon 2026 | OpenAI</w:t>
       </w:r>
     </w:p>
     <w:p>
@@ -1811,33 +1909,52 @@
           <w:szCs w:val="20"/>
         </w:rPr>
         <w:tab/>
-        <w:t>July 2026</w:t>
-      </w:r>
-    </w:p>
-    <w:p>
-      <w:pPr>
-        <w:spacing w:after="0" w:line="240" w:lineRule="auto"/>
-        <w:rPr>
-          <w:rFonts w:ascii="Times New Roman" w:hAnsi="Times New Roman" w:cs="Times New Roman"/>
-          <w:sz w:val="20"/>
-          <w:szCs w:val="20"/>
-        </w:rPr>
-      </w:pPr>
-      <w:r>
-        <w:rPr>
-          <w:rFonts w:ascii="Times New Roman" w:hAnsi="Times New Roman" w:cs="Times New Roman"/>
-          <w:sz w:val="20"/>
-          <w:szCs w:val="20"/>
-        </w:rPr>
-        <w:t>OpenAI Build Week Hackathon 2026 | OpenAI</w:t>
-      </w:r>
-    </w:p>
-    <w:p>
-      <w:pPr>
-        <w:tabs>
-          <w:tab w:val="right" w:pos="10466"/>
-        </w:tabs>
-        <w:spacing w:after="0" w:line="240" w:lineRule="auto"/>
+      </w:r>
+      <w:r>
+        <w:rPr>
+          <w:rFonts w:ascii="Times New Roman" w:hAnsi="Times New Roman" w:cs="Times New Roman"/>
+          <w:sz w:val="20"/>
+          <w:szCs w:val="20"/>
+        </w:rPr>
+        <w:t xml:space="preserve">    </w:t>
+      </w:r>
+      <w:r>
+        <w:rPr>
+          <w:rFonts w:ascii="Times New Roman" w:hAnsi="Times New Roman" w:cs="Times New Roman"/>
+          <w:sz w:val="20"/>
+          <w:szCs w:val="20"/>
+        </w:rPr>
+        <w:t>May 2026</w:t>
+      </w:r>
+    </w:p>
+    <w:p>
+      <w:pPr>
+        <w:spacing w:after="0" w:line="240" w:lineRule="auto"/>
+        <w:rPr>
+          <w:rFonts w:ascii="Times New Roman" w:hAnsi="Times New Roman" w:cs="Times New Roman"/>
+          <w:sz w:val="20"/>
+          <w:szCs w:val="20"/>
+        </w:rPr>
+      </w:pPr>
+      <w:r>
+        <w:rPr>
+          <w:rFonts w:ascii="Times New Roman" w:hAnsi="Times New Roman" w:cs="Times New Roman"/>
+          <w:sz w:val="20"/>
+          <w:szCs w:val="20"/>
+        </w:rPr>
+        <w:t>Refactory Hackathon 2026 | Refactory</w:t>
+      </w:r>
+    </w:p>
+    <w:p>
+      <w:pPr>
+        <w:spacing w:after="0" w:line="240" w:lineRule="auto"/>
+        <w:rPr>
+          <w:rFonts w:ascii="Times New Roman" w:hAnsi="Times New Roman" w:cs="Times New Roman"/>
+          <w:sz w:val="20"/>
+          <w:szCs w:val="20"/>
+        </w:rPr>
+      </w:pPr>
+      <w:r>
         <w:rPr>
           <w:rFonts w:ascii="Times New Roman" w:hAnsi="Times New Roman" w:cs="Times New Roman"/>
           <w:b/>
@@ -1845,28 +1962,6 @@
           <w:sz w:val="20"/>
           <w:szCs w:val="20"/>
         </w:rPr>
-      </w:pPr>
-    </w:p>
-    <w:p>
-      <w:pPr>
-        <w:tabs>
-          <w:tab w:val="right" w:pos="10466"/>
-        </w:tabs>
-        <w:spacing w:after="0" w:line="240" w:lineRule="auto"/>
-        <w:rPr>
-          <w:rFonts w:ascii="Times New Roman" w:hAnsi="Times New Roman" w:cs="Times New Roman"/>
-          <w:sz w:val="20"/>
-          <w:szCs w:val="20"/>
-        </w:rPr>
-      </w:pPr>
-      <w:r>
-        <w:rPr>
-          <w:rFonts w:ascii="Times New Roman" w:hAnsi="Times New Roman" w:cs="Times New Roman"/>
-          <w:b/>
-          <w:bCs/>
-          <w:sz w:val="20"/>
-          <w:szCs w:val="20"/>
-        </w:rPr>
         <w:t>Finalist</w:t>
       </w:r>
       <w:r>
@@ -1876,58 +1971,6 @@
           <w:szCs w:val="20"/>
         </w:rPr>
         <w:tab/>
-        <w:t>May 2026</w:t>
-      </w:r>
-    </w:p>
-    <w:p>
-      <w:pPr>
-        <w:spacing w:after="0" w:line="240" w:lineRule="auto"/>
-        <w:rPr>
-          <w:rFonts w:ascii="Times New Roman" w:hAnsi="Times New Roman" w:cs="Times New Roman"/>
-          <w:sz w:val="20"/>
-          <w:szCs w:val="20"/>
-        </w:rPr>
-      </w:pPr>
-      <w:r>
-        <w:rPr>
-          <w:rFonts w:ascii="Times New Roman" w:hAnsi="Times New Roman" w:cs="Times New Roman"/>
-          <w:sz w:val="20"/>
-          <w:szCs w:val="20"/>
-        </w:rPr>
-        <w:t>Refactory Hackathon 2026 | Refactory</w:t>
-      </w:r>
-    </w:p>
-    <w:p>
-      <w:pPr>
-        <w:spacing w:after="0" w:line="240" w:lineRule="auto"/>
-        <w:rPr>
-          <w:rFonts w:ascii="Times New Roman" w:hAnsi="Times New Roman" w:cs="Times New Roman"/>
-          <w:sz w:val="20"/>
-          <w:szCs w:val="20"/>
-        </w:rPr>
-      </w:pPr>
-    </w:p>
-    <w:p>
-      <w:pPr>
-        <w:tabs>
-          <w:tab w:val="right" w:pos="10466"/>
-        </w:tabs>
-        <w:spacing w:after="0" w:line="240" w:lineRule="auto"/>
-        <w:rPr>
-          <w:rFonts w:ascii="Times New Roman" w:hAnsi="Times New Roman" w:cs="Times New Roman"/>
-          <w:sz w:val="20"/>
-          <w:szCs w:val="20"/>
-        </w:rPr>
-      </w:pPr>
-      <w:r>
-        <w:rPr>
-          <w:rFonts w:ascii="Times New Roman" w:hAnsi="Times New Roman" w:cs="Times New Roman"/>
-          <w:b/>
-          <w:bCs/>
-          <w:sz w:val="20"/>
-          <w:szCs w:val="20"/>
-        </w:rPr>
-        <w:t>Finalist</w:t>
       </w:r>
       <w:r>
         <w:rPr>
@@ -1936,6 +1979,102 @@
           <w:szCs w:val="20"/>
         </w:rPr>
         <w:tab/>
+      </w:r>
+      <w:r>
+        <w:rPr>
+          <w:rFonts w:ascii="Times New Roman" w:hAnsi="Times New Roman" w:cs="Times New Roman"/>
+          <w:sz w:val="20"/>
+          <w:szCs w:val="20"/>
+        </w:rPr>
+        <w:tab/>
+      </w:r>
+      <w:r>
+        <w:rPr>
+          <w:rFonts w:ascii="Times New Roman" w:hAnsi="Times New Roman" w:cs="Times New Roman"/>
+          <w:sz w:val="20"/>
+          <w:szCs w:val="20"/>
+        </w:rPr>
+        <w:tab/>
+      </w:r>
+      <w:r>
+        <w:rPr>
+          <w:rFonts w:ascii="Times New Roman" w:hAnsi="Times New Roman" w:cs="Times New Roman"/>
+          <w:sz w:val="20"/>
+          <w:szCs w:val="20"/>
+        </w:rPr>
+        <w:tab/>
+      </w:r>
+      <w:r>
+        <w:rPr>
+          <w:rFonts w:ascii="Times New Roman" w:hAnsi="Times New Roman" w:cs="Times New Roman"/>
+          <w:sz w:val="20"/>
+          <w:szCs w:val="20"/>
+        </w:rPr>
+        <w:tab/>
+      </w:r>
+      <w:r>
+        <w:rPr>
+          <w:rFonts w:ascii="Times New Roman" w:hAnsi="Times New Roman" w:cs="Times New Roman"/>
+          <w:sz w:val="20"/>
+          <w:szCs w:val="20"/>
+        </w:rPr>
+        <w:tab/>
+      </w:r>
+      <w:r>
+        <w:rPr>
+          <w:rFonts w:ascii="Times New Roman" w:hAnsi="Times New Roman" w:cs="Times New Roman"/>
+          <w:sz w:val="20"/>
+          <w:szCs w:val="20"/>
+        </w:rPr>
+        <w:tab/>
+      </w:r>
+      <w:r>
+        <w:rPr>
+          <w:rFonts w:ascii="Times New Roman" w:hAnsi="Times New Roman" w:cs="Times New Roman"/>
+          <w:sz w:val="20"/>
+          <w:szCs w:val="20"/>
+        </w:rPr>
+        <w:tab/>
+      </w:r>
+      <w:r>
+        <w:rPr>
+          <w:rFonts w:ascii="Times New Roman" w:hAnsi="Times New Roman" w:cs="Times New Roman"/>
+          <w:sz w:val="20"/>
+          <w:szCs w:val="20"/>
+        </w:rPr>
+        <w:tab/>
+      </w:r>
+      <w:r>
+        <w:rPr>
+          <w:rFonts w:ascii="Times New Roman" w:hAnsi="Times New Roman" w:cs="Times New Roman"/>
+          <w:sz w:val="20"/>
+          <w:szCs w:val="20"/>
+        </w:rPr>
+        <w:tab/>
+      </w:r>
+      <w:r>
+        <w:rPr>
+          <w:rFonts w:ascii="Times New Roman" w:hAnsi="Times New Roman" w:cs="Times New Roman"/>
+          <w:sz w:val="20"/>
+          <w:szCs w:val="20"/>
+        </w:rPr>
+        <w:tab/>
+      </w:r>
+      <w:r>
+        <w:rPr>
+          <w:rFonts w:ascii="Times New Roman" w:hAnsi="Times New Roman" w:cs="Times New Roman"/>
+          <w:sz w:val="20"/>
+          <w:szCs w:val="20"/>
+        </w:rPr>
+        <w:tab/>
+        <w:t xml:space="preserve">    </w:t>
+      </w:r>
+      <w:r>
+        <w:rPr>
+          <w:rFonts w:ascii="Times New Roman" w:hAnsi="Times New Roman" w:cs="Times New Roman"/>
+          <w:sz w:val="20"/>
+          <w:szCs w:val="20"/>
+        </w:rPr>
         <w:t>April 2026</w:t>
       </w:r>
     </w:p>
@@ -2008,6 +2147,85 @@
           <w:sz w:val="20"/>
           <w:szCs w:val="20"/>
         </w:rPr>
+        <w:t>AWS Certified AI Practitioner</w:t>
+      </w:r>
+    </w:p>
+    <w:p>
+      <w:pPr>
+        <w:pStyle w:val="ListParagraph"/>
+        <w:spacing w:after="0" w:line="240" w:lineRule="auto"/>
+        <w:rPr>
+          <w:rFonts w:ascii="Times New Roman" w:hAnsi="Times New Roman" w:cs="Times New Roman"/>
+          <w:sz w:val="20"/>
+          <w:szCs w:val="20"/>
+        </w:rPr>
+      </w:pPr>
+      <w:r>
+        <w:rPr>
+          <w:rFonts w:ascii="Times New Roman" w:hAnsi="Times New Roman" w:cs="Times New Roman"/>
+          <w:sz w:val="20"/>
+          <w:szCs w:val="20"/>
+        </w:rPr>
+        <w:t xml:space="preserve">Issued: </w:t>
+      </w:r>
+      <w:r>
+        <w:rPr>
+          <w:rFonts w:ascii="Times New Roman" w:hAnsi="Times New Roman" w:cs="Times New Roman"/>
+          <w:sz w:val="20"/>
+          <w:szCs w:val="20"/>
+        </w:rPr>
+        <w:t>October</w:t>
+      </w:r>
+      <w:r>
+        <w:rPr>
+          <w:rFonts w:ascii="Times New Roman" w:hAnsi="Times New Roman" w:cs="Times New Roman"/>
+          <w:sz w:val="20"/>
+          <w:szCs w:val="20"/>
+        </w:rPr>
+        <w:t xml:space="preserve"> 2026 | Credential:</w:t>
+      </w:r>
+      <w:r>
+        <w:rPr>
+          <w:rFonts w:ascii="Times New Roman" w:hAnsi="Times New Roman" w:cs="Times New Roman"/>
+          <w:sz w:val="20"/>
+          <w:szCs w:val="20"/>
+        </w:rPr>
+        <w:t xml:space="preserve"> </w:t>
+      </w:r>
+      <w:hyperlink r:id="rId7" w:history="1">
+        <w:proofErr w:type="spellStart"/>
+        <w:r>
+          <w:rPr>
+            <w:rStyle w:val="Hyperlink"/>
+            <w:rFonts w:ascii="Times New Roman" w:hAnsi="Times New Roman" w:cs="Times New Roman"/>
+            <w:sz w:val="20"/>
+            <w:szCs w:val="20"/>
+          </w:rPr>
+          <w:t>Credly</w:t>
+        </w:r>
+        <w:proofErr w:type="spellEnd"/>
+      </w:hyperlink>
+    </w:p>
+    <w:p>
+      <w:pPr>
+        <w:pStyle w:val="ListParagraph"/>
+        <w:numPr>
+          <w:ilvl w:val="0"/>
+          <w:numId w:val="7"/>
+        </w:numPr>
+        <w:spacing w:after="0" w:line="240" w:lineRule="auto"/>
+        <w:rPr>
+          <w:rFonts w:ascii="Times New Roman" w:hAnsi="Times New Roman" w:cs="Times New Roman"/>
+          <w:sz w:val="20"/>
+          <w:szCs w:val="20"/>
+        </w:rPr>
+      </w:pPr>
+      <w:r>
+        <w:rPr>
+          <w:rFonts w:ascii="Times New Roman" w:hAnsi="Times New Roman" w:cs="Times New Roman"/>
+          <w:sz w:val="20"/>
+          <w:szCs w:val="20"/>
+        </w:rPr>
         <w:t>Google Advanced Data Analytics Professional | Google</w:t>
       </w:r>
     </w:p>
@@ -2029,7 +2247,7 @@
         </w:rPr>
         <w:t xml:space="preserve">Issued: July 2026 | Credential ID: </w:t>
       </w:r>
-      <w:hyperlink r:id="rId7" w:history="1">
+      <w:hyperlink r:id="rId8" w:history="1">
         <w:r>
           <w:rPr>
             <w:rStyle w:val="Hyperlink"/>
@@ -2091,7 +2309,7 @@
         </w:rPr>
         <w:t xml:space="preserve"> </w:t>
       </w:r>
-      <w:hyperlink r:id="rId8" w:history="1">
+      <w:hyperlink r:id="rId9" w:history="1">
         <w:r>
           <w:rPr>
             <w:rStyle w:val="Hyperlink"/>
@@ -2144,7 +2362,7 @@
         </w:rPr>
         <w:t xml:space="preserve">Issued: March 2026 | Credential ID: </w:t>
       </w:r>
-      <w:hyperlink r:id="rId9" w:history="1">
+      <w:hyperlink r:id="rId10" w:history="1">
         <w:r>
           <w:rPr>
             <w:rStyle w:val="Hyperlink"/>
@@ -2197,7 +2415,7 @@
         </w:rPr>
         <w:t xml:space="preserve">Issued: March 2026 | Credential ID: </w:t>
       </w:r>
-      <w:hyperlink r:id="rId10" w:history="1">
+      <w:hyperlink r:id="rId11" w:history="1">
         <w:r>
           <w:rPr>
             <w:rStyle w:val="Hyperlink"/>
@@ -2250,7 +2468,7 @@
         </w:rPr>
         <w:t xml:space="preserve">Issued: September 2025 | Credential: </w:t>
       </w:r>
-      <w:hyperlink r:id="rId11" w:history="1">
+      <w:hyperlink r:id="rId12" w:history="1">
         <w:r>
           <w:rPr>
             <w:rStyle w:val="Hyperlink"/>
@@ -3116,6 +3334,119 @@
     <w:nsid w:val="6E091242"/>
     <w:multiLevelType w:val="hybridMultilevel"/>
     <w:tmpl w:val="21228A98"/>
+    <w:lvl w:ilvl="0" w:tplc="38090001">
+      <w:start w:val="1"/>
+      <w:numFmt w:val="bullet"/>
+      <w:lvlText w:val=""/>
+      <w:lvlJc w:val="left"/>
+      <w:pPr>
+        <w:ind w:left="720" w:hanging="360"/>
+      </w:pPr>
+      <w:rPr>
+        <w:rFonts w:ascii="Symbol" w:hAnsi="Symbol" w:hint="default"/>
+      </w:rPr>
+    </w:lvl>
+    <w:lvl w:ilvl="1" w:tplc="38090003" w:tentative="1">
+      <w:start w:val="1"/>
+      <w:numFmt w:val="bullet"/>
+      <w:lvlText w:val="o"/>
+      <w:lvlJc w:val="left"/>
+      <w:pPr>
+        <w:ind w:left="1440" w:hanging="360"/>
+      </w:pPr>
+      <w:rPr>
+        <w:rFonts w:ascii="Courier New" w:hAnsi="Courier New" w:cs="Courier New" w:hint="default"/>
+      </w:rPr>
+    </w:lvl>
+    <w:lvl w:ilvl="2" w:tplc="38090005" w:tentative="1">
+      <w:start w:val="1"/>
+      <w:numFmt w:val="bullet"/>
+      <w:lvlText w:val=""/>
+      <w:lvlJc w:val="left"/>
+      <w:pPr>
+        <w:ind w:left="2160" w:hanging="360"/>
+      </w:pPr>
+      <w:rPr>
+        <w:rFonts w:ascii="Wingdings" w:hAnsi="Wingdings" w:hint="default"/>
+      </w:rPr>
+    </w:lvl>
+    <w:lvl w:ilvl="3" w:tplc="38090001" w:tentative="1">
+      <w:start w:val="1"/>
+      <w:numFmt w:val="bullet"/>
+      <w:lvlText w:val=""/>
+      <w:lvlJc w:val="left"/>
+      <w:pPr>
+        <w:ind w:left="2880" w:hanging="360"/>
+      </w:pPr>
+      <w:rPr>
+        <w:rFonts w:ascii="Symbol" w:hAnsi="Symbol" w:hint="default"/>
+      </w:rPr>
+    </w:lvl>
+    <w:lvl w:ilvl="4" w:tplc="38090003" w:tentative="1">
+      <w:start w:val="1"/>
+      <w:numFmt w:val="bullet"/>
+      <w:lvlText w:val="o"/>
+      <w:lvlJc w:val="left"/>
+      <w:pPr>
+        <w:ind w:left="3600" w:hanging="360"/>
+      </w:pPr>
+      <w:rPr>
+        <w:rFonts w:ascii="Courier New" w:hAnsi="Courier New" w:cs="Courier New" w:hint="default"/>
+      </w:rPr>
+    </w:lvl>
+    <w:lvl w:ilvl="5" w:tplc="38090005" w:tentative="1">
+      <w:start w:val="1"/>
+      <w:numFmt w:val="bullet"/>
+      <w:lvlText w:val=""/>
+      <w:lvlJc w:val="left"/>
+      <w:pPr>
+        <w:ind w:left="4320" w:hanging="360"/>
+      </w:pPr>
+      <w:rPr>
+        <w:rFonts w:ascii="Wingdings" w:hAnsi="Wingdings" w:hint="default"/>
+      </w:rPr>
+    </w:lvl>
+    <w:lvl w:ilvl="6" w:tplc="38090001" w:tentative="1">
+      <w:start w:val="1"/>
+      <w:numFmt w:val="bullet"/>
+      <w:lvlText w:val=""/>
+      <w:lvlJc w:val="left"/>
+      <w:pPr>
+        <w:ind w:left="5040" w:hanging="360"/>
+      </w:pPr>
+      <w:rPr>
+        <w:rFonts w:ascii="Symbol" w:hAnsi="Symbol" w:hint="default"/>
+      </w:rPr>
+    </w:lvl>
+    <w:lvl w:ilvl="7" w:tplc="38090003" w:tentative="1">
+      <w:start w:val="1"/>
+      <w:numFmt w:val="bullet"/>
+      <w:lvlText w:val="o"/>
+      <w:lvlJc w:val="left"/>
+      <w:pPr>
+        <w:ind w:left="5760" w:hanging="360"/>
+      </w:pPr>
+      <w:rPr>
+        <w:rFonts w:ascii="Courier New" w:hAnsi="Courier New" w:cs="Courier New" w:hint="default"/>
+      </w:rPr>
+    </w:lvl>
+    <w:lvl w:ilvl="8" w:tplc="38090005" w:tentative="1">
+      <w:start w:val="1"/>
+      <w:numFmt w:val="bullet"/>
+      <w:lvlText w:val=""/>
+      <w:lvlJc w:val="left"/>
+      <w:pPr>
+        <w:ind w:left="6480" w:hanging="360"/>
+      </w:pPr>
+      <w:rPr>
+        <w:rFonts w:ascii="Wingdings" w:hAnsi="Wingdings" w:hint="default"/>
+      </w:rPr>
+    </w:lvl>
+  </w:abstractNum>
+  <w:abstractNum w:abstractNumId="7" w15:restartNumberingAfterBreak="0">
+    <w:nsid w:val="75A936CA"/>
+    <w:multiLevelType w:val="hybridMultilevel"/>
+    <w:tmpl w:val="3C20DFE6"/>
     <w:lvl w:ilvl="0" w:tplc="38090001">
       <w:start w:val="1"/>
       <w:numFmt w:val="bullet"/>
@@ -3245,6 +3576,9 @@
   </w:num>
   <w:num w:numId="7" w16cid:durableId="1771463123">
     <w:abstractNumId w:val="2"/>
+  </w:num>
+  <w:num w:numId="8" w16cid:durableId="436027368">
+    <w:abstractNumId w:val="7"/>
   </w:num>
 </w:numbering>
 </file>
@@ -3649,7 +3983,7 @@
   <w:style w:type="paragraph" w:default="1" w:styleId="Normal">
     <w:name w:val="Normal"/>
     <w:qFormat/>
-    <w:rsid w:val="002E6A06"/>
+    <w:rsid w:val="0037625C"/>
   </w:style>
   <w:style w:type="paragraph" w:styleId="Heading1">
     <w:name w:val="heading 1"/>
@@ -3853,7 +4187,6 @@
   <w:style w:type="character" w:default="1" w:styleId="DefaultParagraphFont">
     <w:name w:val="Default Paragraph Font"/>
     <w:uiPriority w:val="1"/>
-    <w:semiHidden/>
     <w:unhideWhenUsed/>
   </w:style>
   <w:style w:type="table" w:default="1" w:styleId="TableNormal">

</xml_diff>